<commit_message>
Tai bai Excersice1.docx len slot1
</commit_message>
<xml_diff>
--- a/Slot1/Excersice1.docx
+++ b/Slot1/Excersice1.docx
@@ -5,453 +5,1675 @@
     <w:p>
       <w:pPr>
         <w:rPr>
-          <w:noProof/>
-        </w:rPr>
-      </w:pPr>
-      <w:r>
-        <w:rPr>
-          <w:noProof/>
-        </w:rPr>
-        <w:t>Kiểm thử phần mềm là gì ?</w:t>
-      </w:r>
-    </w:p>
-    <w:p>
-      <w:pPr>
-        <w:rPr>
-          <w:noProof/>
-        </w:rPr>
-      </w:pPr>
-      <w:r>
-        <w:rPr>
-          <w:noProof/>
-        </w:rPr>
-        <w:t>Tại sao kiểm thử phần mềm là cần thiết? Cho 5 ví dụ về lỗi phần mềm, tác động như thế nào?</w:t>
-      </w:r>
-    </w:p>
-    <w:p>
-      <w:pPr>
-        <w:rPr>
-          <w:noProof/>
-        </w:rPr>
-      </w:pPr>
-      <w:r>
-        <w:rPr>
-          <w:noProof/>
-        </w:rPr>
-        <w:t>Phân biệt verification và validation</w:t>
-      </w:r>
-    </w:p>
-    <w:p>
-      <w:pPr>
-        <w:pStyle w:val="ListParagraph"/>
-        <w:numPr>
-          <w:ilvl w:val="0"/>
-          <w:numId w:val="5"/>
-        </w:numPr>
-        <w:rPr>
-          <w:noProof/>
-        </w:rPr>
-      </w:pPr>
-      <w:r>
-        <w:rPr>
-          <w:noProof/>
-        </w:rPr>
-        <w:t>Khái niệm kiểm thử</w:t>
-      </w:r>
-      <w:r>
-        <w:rPr>
-          <w:noProof/>
-        </w:rPr>
-        <w:br/>
-        <w:t>1.1. Định nghĩa</w:t>
-      </w:r>
-    </w:p>
-    <w:p>
-      <w:pPr>
-        <w:pStyle w:val="0NoiDung"/>
-      </w:pPr>
-      <w:r>
-        <w:t>1. Kiểm thử phần mềm là một quá trình bao gồm tất cả các hoạt động trong vòng đời phát triển phần mềm, bao gồm cả kiểm thử tĩnh (static testing) và kiểm thử động (dynamic testing)</w:t>
-      </w:r>
-    </w:p>
-    <w:p>
-      <w:pPr>
-        <w:pStyle w:val="0NoiDung"/>
-      </w:pPr>
-      <w:r>
-        <w:t>Quá trình này liên quan đến việc lập kế hoạch, chuẩn bị và đánh giá các sản phẩm phần mềm cùng các sản phẩm liên quan để xác định xem chúng có đáp ứng các yêu cầu đã được chỉ định hay không, chứng minh rằng chúng phù hợp với mục đích sử dụng, và nhằm mục đích phát hiện ra các khiếm khuyết (defects)</w:t>
-      </w:r>
-    </w:p>
-    <w:p>
-      <w:pPr>
-        <w:pStyle w:val="TieuDe1"/>
-        <w:rPr>
-          <w:noProof/>
-        </w:rPr>
-      </w:pPr>
-      <w:r>
-        <w:t xml:space="preserve">1.2 </w:t>
-      </w:r>
-      <w:proofErr w:type="spellStart"/>
-      <w:r>
-        <w:t>Giải</w:t>
-      </w:r>
-      <w:proofErr w:type="spellEnd"/>
-      <w:r>
-        <w:t xml:space="preserve"> </w:t>
-      </w:r>
-      <w:proofErr w:type="spellStart"/>
-      <w:r>
-        <w:t>thích</w:t>
-      </w:r>
-      <w:proofErr w:type="spellEnd"/>
-    </w:p>
-    <w:p>
-      <w:pPr>
-        <w:pStyle w:val="0NoiDung"/>
-      </w:pPr>
-      <w:r>
-        <w:t>Kiểm thử không chỉ đơn thuần là việc chạy code mà còn bao gồm cả các hoạt động trước và sau khi thực thi như đánh giá tài liệu, phân tích mã nguồn và báo cáo kết quả.</w:t>
-      </w:r>
-    </w:p>
-    <w:p>
-      <w:pPr>
-        <w:ind w:left="360"/>
-        <w:rPr>
-          <w:noProof/>
-        </w:rPr>
-      </w:pPr>
-    </w:p>
-    <w:p>
-      <w:pPr>
-        <w:pStyle w:val="0NoiDung"/>
-      </w:pPr>
-      <w:r>
-        <w:t xml:space="preserve">2. </w:t>
-      </w:r>
-      <w:r>
-        <w:t>Bởi vì quá trình phát triển phần mềm được thực hiện bởi con người, mà con người thì có thể mắc sai lầm, từ đó tạo ra các khiếm khuyết (bugs/defects) trong hệ thống. Kiểm thử phần mềm là cần thiết vì những lý do sau:</w:t>
-      </w:r>
-    </w:p>
-    <w:p>
-      <w:pPr>
-        <w:pStyle w:val="0NoiDung"/>
-      </w:pPr>
-      <w:r>
-        <w:rPr>
-          <w:b/>
-          <w:bCs/>
-        </w:rPr>
-        <w:t>Giảm thiểu rủi ro hỏng hóc (failures):</w:t>
-      </w:r>
-      <w:r>
-        <w:t xml:space="preserve"> Kiểm thử nghiêm ngặt giúp ngăn chặn các sự cố xuất hiện khi phần mềm được đưa vào sử dụng thực tế.</w:t>
-      </w:r>
-    </w:p>
-    <w:p>
-      <w:pPr>
-        <w:pStyle w:val="0NoiDung"/>
-      </w:pPr>
-      <w:r>
-        <w:rPr>
-          <w:b/>
-          <w:bCs/>
-        </w:rPr>
-        <w:t>Tiết kiệm thời gian và chi phí:</w:t>
-      </w:r>
-      <w:r>
-        <w:t xml:space="preserve"> Việc phát hiện lỗi ngay từ các giai đoạn sớm (ví dụ như rà soát yêu cầu hệ thống hoặc thiết kế) giúp tránh được việc xây dựng sai phần mềm, giảm chi phí sửa chữa muộn.</w:t>
-      </w:r>
-    </w:p>
-    <w:p>
-      <w:pPr>
-        <w:pStyle w:val="0NoiDung"/>
-      </w:pPr>
-      <w:r>
-        <w:rPr>
-          <w:b/>
-          <w:bCs/>
-        </w:rPr>
-        <w:t>Đảm bảo chất lượng và sự hài lòng của các bên liên quan:</w:t>
-      </w:r>
-      <w:r>
-        <w:t xml:space="preserve"> Nó xác minh và xác nhận phần mềm không chỉ được xây dựng đúng theo đặc tả mà còn đáp ứng được kỳ vọng thực tế của người dùng.</w:t>
-      </w:r>
-    </w:p>
-    <w:p>
-      <w:pPr>
-        <w:pStyle w:val="0NoiDung"/>
-      </w:pPr>
-      <w:r>
-        <w:rPr>
-          <w:b/>
-          <w:bCs/>
-        </w:rPr>
-        <w:t>Tuân thủ tiêu chuẩn và pháp luật:</w:t>
-      </w:r>
-      <w:r>
-        <w:t xml:space="preserve"> Đối với một số ngành đặc thù (như thiết bị y tế hay xe tự lái), kiểm thử là bắt buộc để đáp ứng các quy định của hợp đồng, tiêu chuẩn pháp lý hoặc các tiêu chuẩn khắt khe của ngành.</w:t>
-      </w:r>
-    </w:p>
-    <w:p>
-      <w:pPr>
-        <w:ind w:left="360"/>
-        <w:rPr>
-          <w:noProof/>
-        </w:rPr>
-      </w:pPr>
-    </w:p>
-    <w:p>
-      <w:pPr>
-        <w:ind w:left="360"/>
-        <w:rPr>
-          <w:noProof/>
-        </w:rPr>
-      </w:pPr>
-    </w:p>
-    <w:p>
-      <w:pPr>
-        <w:pStyle w:val="0NoiDung"/>
-      </w:pPr>
-      <w:r>
-        <w:lastRenderedPageBreak/>
-        <w:t>2.1</w:t>
-      </w:r>
-    </w:p>
-    <w:p>
-      <w:pPr>
-        <w:numPr>
-          <w:ilvl w:val="0"/>
-          <w:numId w:val="3"/>
-        </w:numPr>
-        <w:rPr>
-          <w:noProof/>
-        </w:rPr>
-      </w:pPr>
-      <w:r>
-        <w:rPr>
+          <w:rFonts w:ascii="Times New Roman" w:hAnsi="Times New Roman" w:cs="Times New Roman"/>
           <w:b/>
           <w:bCs/>
           <w:noProof/>
         </w:rPr>
-        <w:t>Ứng dụng bị dừng đột ngột hoặc web bị treo khi đang thanh toán:</w:t>
-      </w:r>
+      </w:pPr>
       <w:r>
         <w:rPr>
-          <w:noProof/>
-        </w:rPr>
-        <w:t xml:space="preserve"> Tác động của lỗi này gây ra sự phiền toái, làm lãng phí thời gian của người dùng, đồng thời công ty có thể bị tổn thất tài chính và suy giảm uy tín kinh doanh.</w:t>
-      </w:r>
-    </w:p>
-    <w:p>
-      <w:pPr>
-        <w:numPr>
-          <w:ilvl w:val="0"/>
-          <w:numId w:val="3"/>
-        </w:numPr>
-        <w:rPr>
-          <w:noProof/>
-        </w:rPr>
-      </w:pPr>
-      <w:r>
-        <w:rPr>
+          <w:rFonts w:ascii="Times New Roman" w:hAnsi="Times New Roman" w:cs="Times New Roman"/>
           <w:b/>
           <w:bCs/>
-          <w:noProof/>
+          <w:sz w:val="28"/>
+          <w:szCs w:val="28"/>
         </w:rPr>
-        <w:t>Giá cả không nhất quán đối với cùng một chuyến bay trên các trang web du lịch:</w:t>
+        <w:t>Mục Lục</w:t>
       </w:r>
       <w:r>
         <w:rPr>
-          <w:noProof/>
-        </w:rPr>
-        <w:t xml:space="preserve"> Việc hiển thị sai hoặc không đồng bộ giá cả cũng gây ảnh hưởng trực tiếp tới tài chính và độ tin cậy của dịch vụ.</w:t>
-      </w:r>
-    </w:p>
-    <w:p>
-      <w:pPr>
-        <w:numPr>
-          <w:ilvl w:val="0"/>
-          <w:numId w:val="3"/>
-        </w:numPr>
-        <w:rPr>
-          <w:noProof/>
-        </w:rPr>
-      </w:pPr>
-      <w:r>
-        <w:rPr>
-          <w:b/>
-          <w:bCs/>
-          <w:noProof/>
-        </w:rPr>
-        <w:t>Lỗi phần mềm trong các hệ thống an toàn trọng yếu (như thiết bị y tế, xe tự lái):</w:t>
-      </w:r>
-      <w:r>
-        <w:rPr>
-          <w:noProof/>
-        </w:rPr>
-        <w:t xml:space="preserve"> Lỗi trong các môi trường này có tác động cực kỳ nghiêm trọng, vì chúng có thể đe dọa trực tiếp đến tính mạng con người, gây chấn thương hoặc thậm chí là tử vong.</w:t>
-      </w:r>
-    </w:p>
-    <w:p>
-      <w:pPr>
-        <w:numPr>
-          <w:ilvl w:val="0"/>
-          <w:numId w:val="3"/>
-        </w:numPr>
-        <w:rPr>
-          <w:noProof/>
-        </w:rPr>
-      </w:pPr>
-      <w:r>
-        <w:rPr>
-          <w:b/>
-          <w:bCs/>
-          <w:noProof/>
-        </w:rPr>
-        <w:t>Phân tích viên kinh doanh định nghĩa sai sức chịu tải của hệ thống:</w:t>
-      </w:r>
-      <w:r>
-        <w:rPr>
-          <w:noProof/>
-        </w:rPr>
-        <w:t xml:space="preserve"> Một hệ thống thương mại điện tử cần hỗ trợ 1.000 người dùng đồng thời, nhưng nếu yêu cầu đưa ra bị lỗi chỉ ghi 100 người, hệ thống sẽ bị cạn kiệt tài nguyên khi đạt mức tải thực tế. Điều này tác động trực tiếp đến thời gian phản hồi và làm hỏng độ tin cậy của phần mềm.</w:t>
-      </w:r>
-    </w:p>
-    <w:p>
-      <w:pPr>
-        <w:numPr>
-          <w:ilvl w:val="0"/>
-          <w:numId w:val="3"/>
-        </w:numPr>
-        <w:rPr>
-          <w:noProof/>
-        </w:rPr>
-      </w:pPr>
-      <w:r>
-        <w:rPr>
-          <w:b/>
-          <w:bCs/>
-          <w:noProof/>
-        </w:rPr>
-        <w:t>Lỗi sai lệch thông số hoặc giao diện gọi hàm (Ví dụ: Sự kiện Tàu thăm dò Mars Orbiter năm 1999):</w:t>
-      </w:r>
-      <w:r>
-        <w:rPr>
-          <w:noProof/>
-        </w:rPr>
-        <w:t xml:space="preserve"> Sự cố xảy ra khi một hệ thống gọi sử dụng hệ đo lường Anh trong khi hệ thống được gọi lại sử dụng hệ mét. Lỗi không đồng nhất đơn vị này đã tác động tàn khốc, làm cho tàu thăm dò bị cháy rụi trong khí quyển, phá hủy hoàn toàn cả một chiến dịch đắt đỏ.</w:t>
-      </w:r>
-    </w:p>
-    <w:p>
-      <w:pPr>
-        <w:pStyle w:val="TIeuDe11"/>
-      </w:pPr>
-      <w:r>
-        <w:t>3</w:t>
-      </w:r>
-      <w:r>
-        <w:t xml:space="preserve"> Phân biệt </w:t>
-      </w:r>
-    </w:p>
-    <w:p>
-      <w:pPr>
-        <w:pStyle w:val="0NoiDung"/>
-      </w:pPr>
-      <w:r>
-        <w:t xml:space="preserve"> </w:t>
-      </w:r>
-      <w:r>
-        <w:rPr>
+          <w:rFonts w:ascii="Times New Roman" w:hAnsi="Times New Roman" w:cs="Times New Roman"/>
           <w:b/>
           <w:bCs/>
         </w:rPr>
-        <w:t>Verification (Xác minh):</w:t>
-      </w:r>
-      <w:r>
-        <w:t xml:space="preserve"> Tập trung vào câu hỏi </w:t>
+        <w:fldChar w:fldCharType="begin"/>
       </w:r>
       <w:r>
         <w:rPr>
+          <w:rFonts w:ascii="Times New Roman" w:hAnsi="Times New Roman" w:cs="Times New Roman"/>
           <w:b/>
           <w:bCs/>
         </w:rPr>
-        <w:t>"Chúng ta đã xây dựng hệ thống đúng kỹ thuật chưa?"</w:t>
-      </w:r>
-      <w:r>
-        <w:t xml:space="preserve"> ("Have we built the system correctly?"). Nó là việc kiểm tra để đánh giá xem một sản phẩm công việc, thành phần hay hệ thống có tuân thủ và đáp ứng </w:t>
+        <w:instrText xml:space="preserve"> TOC \o "1-3" \h \z \u </w:instrText>
       </w:r>
       <w:r>
         <w:rPr>
+          <w:rFonts w:ascii="Times New Roman" w:hAnsi="Times New Roman" w:cs="Times New Roman"/>
           <w:b/>
           <w:bCs/>
         </w:rPr>
-        <w:t>đúng với các yêu cầu đã được chỉ định (đặc tả)</w:t>
-      </w:r>
-      <w:r>
-        <w:t xml:space="preserve"> hay không.</w:t>
-      </w:r>
-    </w:p>
-    <w:p>
-      <w:pPr>
-        <w:numPr>
-          <w:ilvl w:val="0"/>
-          <w:numId w:val="4"/>
-        </w:numPr>
+        <w:fldChar w:fldCharType="separate"/>
+      </w:r>
+    </w:p>
+    <w:p>
+      <w:pPr>
+        <w:pStyle w:val="TOC1"/>
+        <w:tabs>
+          <w:tab w:val="left" w:pos="522"/>
+          <w:tab w:val="right" w:leader="dot" w:pos="9350"/>
+        </w:tabs>
         <w:rPr>
+          <w:rFonts w:asciiTheme="minorHAnsi" w:hAnsiTheme="minorHAnsi"/>
           <w:noProof/>
+          <w:sz w:val="24"/>
         </w:rPr>
       </w:pPr>
-      <w:r>
+      <w:hyperlink w:anchor="_Toc229733043" w:history="1">
+        <w:r>
+          <w:rPr>
+            <w:rStyle w:val="Hyperlink"/>
+            <w:noProof/>
+          </w:rPr>
+          <w:t>1.</w:t>
+        </w:r>
+        <w:r>
+          <w:rPr>
+            <w:rFonts w:asciiTheme="minorHAnsi" w:hAnsiTheme="minorHAnsi"/>
+            <w:noProof/>
+            <w:sz w:val="24"/>
+          </w:rPr>
+          <w:tab/>
+        </w:r>
+        <w:r>
+          <w:rPr>
+            <w:rStyle w:val="Hyperlink"/>
+            <w:noProof/>
+          </w:rPr>
+          <w:t>Kiểm thử phần mềm là gì?</w:t>
+        </w:r>
+        <w:r>
+          <w:rPr>
+            <w:noProof/>
+            <w:webHidden/>
+          </w:rPr>
+          <w:tab/>
+        </w:r>
+        <w:r>
+          <w:rPr>
+            <w:noProof/>
+            <w:webHidden/>
+          </w:rPr>
+          <w:fldChar w:fldCharType="begin"/>
+        </w:r>
+        <w:r>
+          <w:rPr>
+            <w:noProof/>
+            <w:webHidden/>
+          </w:rPr>
+          <w:instrText xml:space="preserve"> PAGEREF _Toc229733043 \h </w:instrText>
+        </w:r>
+        <w:r>
+          <w:rPr>
+            <w:noProof/>
+            <w:webHidden/>
+          </w:rPr>
+        </w:r>
+        <w:r>
+          <w:rPr>
+            <w:noProof/>
+            <w:webHidden/>
+          </w:rPr>
+          <w:fldChar w:fldCharType="separate"/>
+        </w:r>
+        <w:r>
+          <w:rPr>
+            <w:noProof/>
+            <w:webHidden/>
+          </w:rPr>
+          <w:t>2</w:t>
+        </w:r>
+        <w:r>
+          <w:rPr>
+            <w:noProof/>
+            <w:webHidden/>
+          </w:rPr>
+          <w:fldChar w:fldCharType="end"/>
+        </w:r>
+      </w:hyperlink>
+    </w:p>
+    <w:p>
+      <w:pPr>
+        <w:pStyle w:val="TOC1"/>
+        <w:tabs>
+          <w:tab w:val="left" w:pos="522"/>
+          <w:tab w:val="right" w:leader="dot" w:pos="9350"/>
+        </w:tabs>
         <w:rPr>
-          <w:b/>
+          <w:rFonts w:asciiTheme="minorHAnsi" w:hAnsiTheme="minorHAnsi"/>
+          <w:noProof/>
+          <w:sz w:val="24"/>
+        </w:rPr>
+      </w:pPr>
+      <w:hyperlink w:anchor="_Toc229733044" w:history="1">
+        <w:r>
+          <w:rPr>
+            <w:rStyle w:val="Hyperlink"/>
+            <w:noProof/>
+          </w:rPr>
+          <w:t>2.</w:t>
+        </w:r>
+        <w:r>
+          <w:rPr>
+            <w:rFonts w:asciiTheme="minorHAnsi" w:hAnsiTheme="minorHAnsi"/>
+            <w:noProof/>
+            <w:sz w:val="24"/>
+          </w:rPr>
+          <w:tab/>
+        </w:r>
+        <w:r>
+          <w:rPr>
+            <w:rStyle w:val="Hyperlink"/>
+            <w:noProof/>
+          </w:rPr>
+          <w:t>Tại sao kiểm thử phần mềm là cần thiết?</w:t>
+        </w:r>
+        <w:r>
+          <w:rPr>
+            <w:noProof/>
+            <w:webHidden/>
+          </w:rPr>
+          <w:tab/>
+        </w:r>
+        <w:r>
+          <w:rPr>
+            <w:noProof/>
+            <w:webHidden/>
+          </w:rPr>
+          <w:fldChar w:fldCharType="begin"/>
+        </w:r>
+        <w:r>
+          <w:rPr>
+            <w:noProof/>
+            <w:webHidden/>
+          </w:rPr>
+          <w:instrText xml:space="preserve"> PAGEREF _Toc229733044 \h </w:instrText>
+        </w:r>
+        <w:r>
+          <w:rPr>
+            <w:noProof/>
+            <w:webHidden/>
+          </w:rPr>
+        </w:r>
+        <w:r>
+          <w:rPr>
+            <w:noProof/>
+            <w:webHidden/>
+          </w:rPr>
+          <w:fldChar w:fldCharType="separate"/>
+        </w:r>
+        <w:r>
+          <w:rPr>
+            <w:noProof/>
+            <w:webHidden/>
+          </w:rPr>
+          <w:t>2</w:t>
+        </w:r>
+        <w:r>
+          <w:rPr>
+            <w:noProof/>
+            <w:webHidden/>
+          </w:rPr>
+          <w:fldChar w:fldCharType="end"/>
+        </w:r>
+      </w:hyperlink>
+    </w:p>
+    <w:p>
+      <w:pPr>
+        <w:pStyle w:val="TOC2"/>
+        <w:tabs>
+          <w:tab w:val="left" w:pos="960"/>
+          <w:tab w:val="right" w:leader="dot" w:pos="9350"/>
+        </w:tabs>
+        <w:rPr>
+          <w:rFonts w:asciiTheme="minorHAnsi" w:hAnsiTheme="minorHAnsi"/>
+          <w:noProof/>
+          <w:sz w:val="24"/>
+        </w:rPr>
+      </w:pPr>
+      <w:hyperlink w:anchor="_Toc229733045" w:history="1">
+        <w:r>
+          <w:rPr>
+            <w:rStyle w:val="Hyperlink"/>
+            <w:noProof/>
+          </w:rPr>
+          <w:t>2.1.</w:t>
+        </w:r>
+        <w:r>
+          <w:rPr>
+            <w:rFonts w:asciiTheme="minorHAnsi" w:hAnsiTheme="minorHAnsi"/>
+            <w:noProof/>
+            <w:sz w:val="24"/>
+          </w:rPr>
+          <w:tab/>
+        </w:r>
+        <w:r>
+          <w:rPr>
+            <w:rStyle w:val="Hyperlink"/>
+            <w:bCs/>
+            <w:noProof/>
+          </w:rPr>
+          <w:t>Giảm thiểu rủi ro hỏng hóc (failures):</w:t>
+        </w:r>
+        <w:r>
+          <w:rPr>
+            <w:noProof/>
+            <w:webHidden/>
+          </w:rPr>
+          <w:tab/>
+        </w:r>
+        <w:r>
+          <w:rPr>
+            <w:noProof/>
+            <w:webHidden/>
+          </w:rPr>
+          <w:fldChar w:fldCharType="begin"/>
+        </w:r>
+        <w:r>
+          <w:rPr>
+            <w:noProof/>
+            <w:webHidden/>
+          </w:rPr>
+          <w:instrText xml:space="preserve"> PAGEREF _Toc229733045 \h </w:instrText>
+        </w:r>
+        <w:r>
+          <w:rPr>
+            <w:noProof/>
+            <w:webHidden/>
+          </w:rPr>
+        </w:r>
+        <w:r>
+          <w:rPr>
+            <w:noProof/>
+            <w:webHidden/>
+          </w:rPr>
+          <w:fldChar w:fldCharType="separate"/>
+        </w:r>
+        <w:r>
+          <w:rPr>
+            <w:noProof/>
+            <w:webHidden/>
+          </w:rPr>
+          <w:t>2</w:t>
+        </w:r>
+        <w:r>
+          <w:rPr>
+            <w:noProof/>
+            <w:webHidden/>
+          </w:rPr>
+          <w:fldChar w:fldCharType="end"/>
+        </w:r>
+      </w:hyperlink>
+    </w:p>
+    <w:p>
+      <w:pPr>
+        <w:pStyle w:val="TOC2"/>
+        <w:tabs>
+          <w:tab w:val="left" w:pos="960"/>
+          <w:tab w:val="right" w:leader="dot" w:pos="9350"/>
+        </w:tabs>
+        <w:rPr>
+          <w:rFonts w:asciiTheme="minorHAnsi" w:hAnsiTheme="minorHAnsi"/>
+          <w:noProof/>
+          <w:sz w:val="24"/>
+        </w:rPr>
+      </w:pPr>
+      <w:hyperlink w:anchor="_Toc229733046" w:history="1">
+        <w:r>
+          <w:rPr>
+            <w:rStyle w:val="Hyperlink"/>
+            <w:noProof/>
+          </w:rPr>
+          <w:t>2.2.</w:t>
+        </w:r>
+        <w:r>
+          <w:rPr>
+            <w:rFonts w:asciiTheme="minorHAnsi" w:hAnsiTheme="minorHAnsi"/>
+            <w:noProof/>
+            <w:sz w:val="24"/>
+          </w:rPr>
+          <w:tab/>
+        </w:r>
+        <w:r>
+          <w:rPr>
+            <w:rStyle w:val="Hyperlink"/>
+            <w:bCs/>
+            <w:noProof/>
+          </w:rPr>
+          <w:t>Tiết kiệm thời gian và chi phí:</w:t>
+        </w:r>
+        <w:r>
+          <w:rPr>
+            <w:noProof/>
+            <w:webHidden/>
+          </w:rPr>
+          <w:tab/>
+        </w:r>
+        <w:r>
+          <w:rPr>
+            <w:noProof/>
+            <w:webHidden/>
+          </w:rPr>
+          <w:fldChar w:fldCharType="begin"/>
+        </w:r>
+        <w:r>
+          <w:rPr>
+            <w:noProof/>
+            <w:webHidden/>
+          </w:rPr>
+          <w:instrText xml:space="preserve"> PAGEREF _Toc229733046 \h </w:instrText>
+        </w:r>
+        <w:r>
+          <w:rPr>
+            <w:noProof/>
+            <w:webHidden/>
+          </w:rPr>
+        </w:r>
+        <w:r>
+          <w:rPr>
+            <w:noProof/>
+            <w:webHidden/>
+          </w:rPr>
+          <w:fldChar w:fldCharType="separate"/>
+        </w:r>
+        <w:r>
+          <w:rPr>
+            <w:noProof/>
+            <w:webHidden/>
+          </w:rPr>
+          <w:t>3</w:t>
+        </w:r>
+        <w:r>
+          <w:rPr>
+            <w:noProof/>
+            <w:webHidden/>
+          </w:rPr>
+          <w:fldChar w:fldCharType="end"/>
+        </w:r>
+      </w:hyperlink>
+    </w:p>
+    <w:p>
+      <w:pPr>
+        <w:pStyle w:val="TOC2"/>
+        <w:tabs>
+          <w:tab w:val="left" w:pos="960"/>
+          <w:tab w:val="right" w:leader="dot" w:pos="9350"/>
+        </w:tabs>
+        <w:rPr>
+          <w:rFonts w:asciiTheme="minorHAnsi" w:hAnsiTheme="minorHAnsi"/>
+          <w:noProof/>
+          <w:sz w:val="24"/>
+        </w:rPr>
+      </w:pPr>
+      <w:hyperlink w:anchor="_Toc229733047" w:history="1">
+        <w:r>
+          <w:rPr>
+            <w:rStyle w:val="Hyperlink"/>
+            <w:noProof/>
+          </w:rPr>
+          <w:t>2.3.</w:t>
+        </w:r>
+        <w:r>
+          <w:rPr>
+            <w:rFonts w:asciiTheme="minorHAnsi" w:hAnsiTheme="minorHAnsi"/>
+            <w:noProof/>
+            <w:sz w:val="24"/>
+          </w:rPr>
+          <w:tab/>
+        </w:r>
+        <w:r>
+          <w:rPr>
+            <w:rStyle w:val="Hyperlink"/>
+            <w:noProof/>
+          </w:rPr>
+          <w:t>Đảm bảo chất lượng và sự hài lòng của các bên liên quan:</w:t>
+        </w:r>
+        <w:r>
+          <w:rPr>
+            <w:noProof/>
+            <w:webHidden/>
+          </w:rPr>
+          <w:tab/>
+        </w:r>
+        <w:r>
+          <w:rPr>
+            <w:noProof/>
+            <w:webHidden/>
+          </w:rPr>
+          <w:fldChar w:fldCharType="begin"/>
+        </w:r>
+        <w:r>
+          <w:rPr>
+            <w:noProof/>
+            <w:webHidden/>
+          </w:rPr>
+          <w:instrText xml:space="preserve"> PAGEREF _Toc229733047 \h </w:instrText>
+        </w:r>
+        <w:r>
+          <w:rPr>
+            <w:noProof/>
+            <w:webHidden/>
+          </w:rPr>
+        </w:r>
+        <w:r>
+          <w:rPr>
+            <w:noProof/>
+            <w:webHidden/>
+          </w:rPr>
+          <w:fldChar w:fldCharType="separate"/>
+        </w:r>
+        <w:r>
+          <w:rPr>
+            <w:noProof/>
+            <w:webHidden/>
+          </w:rPr>
+          <w:t>3</w:t>
+        </w:r>
+        <w:r>
+          <w:rPr>
+            <w:noProof/>
+            <w:webHidden/>
+          </w:rPr>
+          <w:fldChar w:fldCharType="end"/>
+        </w:r>
+      </w:hyperlink>
+    </w:p>
+    <w:p>
+      <w:pPr>
+        <w:pStyle w:val="TOC2"/>
+        <w:tabs>
+          <w:tab w:val="left" w:pos="960"/>
+          <w:tab w:val="right" w:leader="dot" w:pos="9350"/>
+        </w:tabs>
+        <w:rPr>
+          <w:rFonts w:asciiTheme="minorHAnsi" w:hAnsiTheme="minorHAnsi"/>
+          <w:noProof/>
+          <w:sz w:val="24"/>
+        </w:rPr>
+      </w:pPr>
+      <w:hyperlink w:anchor="_Toc229733048" w:history="1">
+        <w:r>
+          <w:rPr>
+            <w:rStyle w:val="Hyperlink"/>
+            <w:noProof/>
+          </w:rPr>
+          <w:t>2.4.</w:t>
+        </w:r>
+        <w:r>
+          <w:rPr>
+            <w:rFonts w:asciiTheme="minorHAnsi" w:hAnsiTheme="minorHAnsi"/>
+            <w:noProof/>
+            <w:sz w:val="24"/>
+          </w:rPr>
+          <w:tab/>
+        </w:r>
+        <w:r>
+          <w:rPr>
+            <w:rStyle w:val="Hyperlink"/>
+            <w:noProof/>
+          </w:rPr>
+          <w:t>Tuân thủ tiêu chuẩn và pháp luật:</w:t>
+        </w:r>
+        <w:r>
+          <w:rPr>
+            <w:noProof/>
+            <w:webHidden/>
+          </w:rPr>
+          <w:tab/>
+        </w:r>
+        <w:r>
+          <w:rPr>
+            <w:noProof/>
+            <w:webHidden/>
+          </w:rPr>
+          <w:fldChar w:fldCharType="begin"/>
+        </w:r>
+        <w:r>
+          <w:rPr>
+            <w:noProof/>
+            <w:webHidden/>
+          </w:rPr>
+          <w:instrText xml:space="preserve"> PAGEREF _Toc229733048 \h </w:instrText>
+        </w:r>
+        <w:r>
+          <w:rPr>
+            <w:noProof/>
+            <w:webHidden/>
+          </w:rPr>
+        </w:r>
+        <w:r>
+          <w:rPr>
+            <w:noProof/>
+            <w:webHidden/>
+          </w:rPr>
+          <w:fldChar w:fldCharType="separate"/>
+        </w:r>
+        <w:r>
+          <w:rPr>
+            <w:noProof/>
+            <w:webHidden/>
+          </w:rPr>
+          <w:t>3</w:t>
+        </w:r>
+        <w:r>
+          <w:rPr>
+            <w:noProof/>
+            <w:webHidden/>
+          </w:rPr>
+          <w:fldChar w:fldCharType="end"/>
+        </w:r>
+      </w:hyperlink>
+    </w:p>
+    <w:p>
+      <w:pPr>
+        <w:pStyle w:val="TOC1"/>
+        <w:tabs>
+          <w:tab w:val="left" w:pos="522"/>
+          <w:tab w:val="right" w:leader="dot" w:pos="9350"/>
+        </w:tabs>
+        <w:rPr>
+          <w:rFonts w:asciiTheme="minorHAnsi" w:hAnsiTheme="minorHAnsi"/>
+          <w:noProof/>
+          <w:sz w:val="24"/>
+        </w:rPr>
+      </w:pPr>
+      <w:hyperlink w:anchor="_Toc229733049" w:history="1">
+        <w:r>
+          <w:rPr>
+            <w:rStyle w:val="Hyperlink"/>
+            <w:noProof/>
+          </w:rPr>
+          <w:t>3.</w:t>
+        </w:r>
+        <w:r>
+          <w:rPr>
+            <w:rFonts w:asciiTheme="minorHAnsi" w:hAnsiTheme="minorHAnsi"/>
+            <w:noProof/>
+            <w:sz w:val="24"/>
+          </w:rPr>
+          <w:tab/>
+        </w:r>
+        <w:r>
+          <w:rPr>
+            <w:rStyle w:val="Hyperlink"/>
+            <w:noProof/>
+          </w:rPr>
+          <w:t>5 ví dụ về lỗi phần mềm và tác động của chúng:</w:t>
+        </w:r>
+        <w:r>
+          <w:rPr>
+            <w:noProof/>
+            <w:webHidden/>
+          </w:rPr>
+          <w:tab/>
+        </w:r>
+        <w:r>
+          <w:rPr>
+            <w:noProof/>
+            <w:webHidden/>
+          </w:rPr>
+          <w:fldChar w:fldCharType="begin"/>
+        </w:r>
+        <w:r>
+          <w:rPr>
+            <w:noProof/>
+            <w:webHidden/>
+          </w:rPr>
+          <w:instrText xml:space="preserve"> PAGEREF _Toc229733049 \h </w:instrText>
+        </w:r>
+        <w:r>
+          <w:rPr>
+            <w:noProof/>
+            <w:webHidden/>
+          </w:rPr>
+        </w:r>
+        <w:r>
+          <w:rPr>
+            <w:noProof/>
+            <w:webHidden/>
+          </w:rPr>
+          <w:fldChar w:fldCharType="separate"/>
+        </w:r>
+        <w:r>
+          <w:rPr>
+            <w:noProof/>
+            <w:webHidden/>
+          </w:rPr>
+          <w:t>3</w:t>
+        </w:r>
+        <w:r>
+          <w:rPr>
+            <w:noProof/>
+            <w:webHidden/>
+          </w:rPr>
+          <w:fldChar w:fldCharType="end"/>
+        </w:r>
+      </w:hyperlink>
+    </w:p>
+    <w:p>
+      <w:pPr>
+        <w:pStyle w:val="TOC2"/>
+        <w:tabs>
+          <w:tab w:val="left" w:pos="960"/>
+          <w:tab w:val="right" w:leader="dot" w:pos="9350"/>
+        </w:tabs>
+        <w:rPr>
+          <w:rFonts w:asciiTheme="minorHAnsi" w:hAnsiTheme="minorHAnsi"/>
+          <w:noProof/>
+          <w:sz w:val="24"/>
+        </w:rPr>
+      </w:pPr>
+      <w:hyperlink w:anchor="_Toc229733050" w:history="1">
+        <w:r>
+          <w:rPr>
+            <w:rStyle w:val="Hyperlink"/>
+            <w:noProof/>
+          </w:rPr>
+          <w:t>3.1.</w:t>
+        </w:r>
+        <w:r>
+          <w:rPr>
+            <w:rFonts w:asciiTheme="minorHAnsi" w:hAnsiTheme="minorHAnsi"/>
+            <w:noProof/>
+            <w:sz w:val="24"/>
+          </w:rPr>
+          <w:tab/>
+        </w:r>
+        <w:r>
+          <w:rPr>
+            <w:rStyle w:val="Hyperlink"/>
+            <w:noProof/>
+          </w:rPr>
+          <w:t>Ứng dụng bị dừng đột ngột hoặc web bị treo khi đang thanh toán:</w:t>
+        </w:r>
+        <w:r>
+          <w:rPr>
+            <w:noProof/>
+            <w:webHidden/>
+          </w:rPr>
+          <w:tab/>
+        </w:r>
+        <w:r>
+          <w:rPr>
+            <w:noProof/>
+            <w:webHidden/>
+          </w:rPr>
+          <w:fldChar w:fldCharType="begin"/>
+        </w:r>
+        <w:r>
+          <w:rPr>
+            <w:noProof/>
+            <w:webHidden/>
+          </w:rPr>
+          <w:instrText xml:space="preserve"> PAGEREF _Toc229733050 \h </w:instrText>
+        </w:r>
+        <w:r>
+          <w:rPr>
+            <w:noProof/>
+            <w:webHidden/>
+          </w:rPr>
+        </w:r>
+        <w:r>
+          <w:rPr>
+            <w:noProof/>
+            <w:webHidden/>
+          </w:rPr>
+          <w:fldChar w:fldCharType="separate"/>
+        </w:r>
+        <w:r>
+          <w:rPr>
+            <w:noProof/>
+            <w:webHidden/>
+          </w:rPr>
+          <w:t>3</w:t>
+        </w:r>
+        <w:r>
+          <w:rPr>
+            <w:noProof/>
+            <w:webHidden/>
+          </w:rPr>
+          <w:fldChar w:fldCharType="end"/>
+        </w:r>
+      </w:hyperlink>
+    </w:p>
+    <w:p>
+      <w:pPr>
+        <w:pStyle w:val="TOC2"/>
+        <w:tabs>
+          <w:tab w:val="left" w:pos="960"/>
+          <w:tab w:val="right" w:leader="dot" w:pos="9350"/>
+        </w:tabs>
+        <w:rPr>
+          <w:rFonts w:asciiTheme="minorHAnsi" w:hAnsiTheme="minorHAnsi"/>
+          <w:noProof/>
+          <w:sz w:val="24"/>
+        </w:rPr>
+      </w:pPr>
+      <w:hyperlink w:anchor="_Toc229733051" w:history="1">
+        <w:r>
+          <w:rPr>
+            <w:rStyle w:val="Hyperlink"/>
+            <w:noProof/>
+          </w:rPr>
+          <w:t>3.2.</w:t>
+        </w:r>
+        <w:r>
+          <w:rPr>
+            <w:rFonts w:asciiTheme="minorHAnsi" w:hAnsiTheme="minorHAnsi"/>
+            <w:noProof/>
+            <w:sz w:val="24"/>
+          </w:rPr>
+          <w:tab/>
+        </w:r>
+        <w:r>
+          <w:rPr>
+            <w:rStyle w:val="Hyperlink"/>
+            <w:bCs/>
+            <w:noProof/>
+          </w:rPr>
+          <w:t>Giá cả không nhất quán đối với cùng một chuyến bay trên các trang web du lịch:</w:t>
+        </w:r>
+        <w:r>
+          <w:rPr>
+            <w:noProof/>
+            <w:webHidden/>
+          </w:rPr>
+          <w:tab/>
+        </w:r>
+        <w:r>
+          <w:rPr>
+            <w:noProof/>
+            <w:webHidden/>
+          </w:rPr>
+          <w:fldChar w:fldCharType="begin"/>
+        </w:r>
+        <w:r>
+          <w:rPr>
+            <w:noProof/>
+            <w:webHidden/>
+          </w:rPr>
+          <w:instrText xml:space="preserve"> PAGEREF _Toc229733051 \h </w:instrText>
+        </w:r>
+        <w:r>
+          <w:rPr>
+            <w:noProof/>
+            <w:webHidden/>
+          </w:rPr>
+        </w:r>
+        <w:r>
+          <w:rPr>
+            <w:noProof/>
+            <w:webHidden/>
+          </w:rPr>
+          <w:fldChar w:fldCharType="separate"/>
+        </w:r>
+        <w:r>
+          <w:rPr>
+            <w:noProof/>
+            <w:webHidden/>
+          </w:rPr>
+          <w:t>3</w:t>
+        </w:r>
+        <w:r>
+          <w:rPr>
+            <w:noProof/>
+            <w:webHidden/>
+          </w:rPr>
+          <w:fldChar w:fldCharType="end"/>
+        </w:r>
+      </w:hyperlink>
+    </w:p>
+    <w:p>
+      <w:pPr>
+        <w:pStyle w:val="TOC2"/>
+        <w:tabs>
+          <w:tab w:val="left" w:pos="960"/>
+          <w:tab w:val="right" w:leader="dot" w:pos="9350"/>
+        </w:tabs>
+        <w:rPr>
+          <w:rFonts w:asciiTheme="minorHAnsi" w:hAnsiTheme="minorHAnsi"/>
+          <w:noProof/>
+          <w:sz w:val="24"/>
+        </w:rPr>
+      </w:pPr>
+      <w:hyperlink w:anchor="_Toc229733052" w:history="1">
+        <w:r>
+          <w:rPr>
+            <w:rStyle w:val="Hyperlink"/>
+            <w:noProof/>
+          </w:rPr>
+          <w:t>3.3.</w:t>
+        </w:r>
+        <w:r>
+          <w:rPr>
+            <w:rFonts w:asciiTheme="minorHAnsi" w:hAnsiTheme="minorHAnsi"/>
+            <w:noProof/>
+            <w:sz w:val="24"/>
+          </w:rPr>
+          <w:tab/>
+        </w:r>
+        <w:r>
+          <w:rPr>
+            <w:rStyle w:val="Hyperlink"/>
+            <w:noProof/>
+          </w:rPr>
+          <w:t>Lỗi phần mềm trong các hệ thống an toàn trọng yếu (như thiết bị y tế, xe tự lái):</w:t>
+        </w:r>
+        <w:r>
+          <w:rPr>
+            <w:noProof/>
+            <w:webHidden/>
+          </w:rPr>
+          <w:tab/>
+        </w:r>
+        <w:r>
+          <w:rPr>
+            <w:noProof/>
+            <w:webHidden/>
+          </w:rPr>
+          <w:fldChar w:fldCharType="begin"/>
+        </w:r>
+        <w:r>
+          <w:rPr>
+            <w:noProof/>
+            <w:webHidden/>
+          </w:rPr>
+          <w:instrText xml:space="preserve"> PAGEREF _Toc229733052 \h </w:instrText>
+        </w:r>
+        <w:r>
+          <w:rPr>
+            <w:noProof/>
+            <w:webHidden/>
+          </w:rPr>
+        </w:r>
+        <w:r>
+          <w:rPr>
+            <w:noProof/>
+            <w:webHidden/>
+          </w:rPr>
+          <w:fldChar w:fldCharType="separate"/>
+        </w:r>
+        <w:r>
+          <w:rPr>
+            <w:noProof/>
+            <w:webHidden/>
+          </w:rPr>
+          <w:t>3</w:t>
+        </w:r>
+        <w:r>
+          <w:rPr>
+            <w:noProof/>
+            <w:webHidden/>
+          </w:rPr>
+          <w:fldChar w:fldCharType="end"/>
+        </w:r>
+      </w:hyperlink>
+    </w:p>
+    <w:p>
+      <w:pPr>
+        <w:pStyle w:val="TOC2"/>
+        <w:tabs>
+          <w:tab w:val="left" w:pos="960"/>
+          <w:tab w:val="right" w:leader="dot" w:pos="9350"/>
+        </w:tabs>
+        <w:rPr>
+          <w:rFonts w:asciiTheme="minorHAnsi" w:hAnsiTheme="minorHAnsi"/>
+          <w:noProof/>
+          <w:sz w:val="24"/>
+        </w:rPr>
+      </w:pPr>
+      <w:hyperlink w:anchor="_Toc229733053" w:history="1">
+        <w:r>
+          <w:rPr>
+            <w:rStyle w:val="Hyperlink"/>
+            <w:noProof/>
+          </w:rPr>
+          <w:t>3.4.</w:t>
+        </w:r>
+        <w:r>
+          <w:rPr>
+            <w:rFonts w:asciiTheme="minorHAnsi" w:hAnsiTheme="minorHAnsi"/>
+            <w:noProof/>
+            <w:sz w:val="24"/>
+          </w:rPr>
+          <w:tab/>
+        </w:r>
+        <w:r>
+          <w:rPr>
+            <w:rStyle w:val="Hyperlink"/>
+            <w:noProof/>
+          </w:rPr>
+          <w:t>Phân tích viên kinh doanh định nghĩa sai sức chịu tải của hệ thống:</w:t>
+        </w:r>
+        <w:r>
+          <w:rPr>
+            <w:noProof/>
+            <w:webHidden/>
+          </w:rPr>
+          <w:tab/>
+        </w:r>
+        <w:r>
+          <w:rPr>
+            <w:noProof/>
+            <w:webHidden/>
+          </w:rPr>
+          <w:fldChar w:fldCharType="begin"/>
+        </w:r>
+        <w:r>
+          <w:rPr>
+            <w:noProof/>
+            <w:webHidden/>
+          </w:rPr>
+          <w:instrText xml:space="preserve"> PAGEREF _Toc229733053 \h </w:instrText>
+        </w:r>
+        <w:r>
+          <w:rPr>
+            <w:noProof/>
+            <w:webHidden/>
+          </w:rPr>
+        </w:r>
+        <w:r>
+          <w:rPr>
+            <w:noProof/>
+            <w:webHidden/>
+          </w:rPr>
+          <w:fldChar w:fldCharType="separate"/>
+        </w:r>
+        <w:r>
+          <w:rPr>
+            <w:noProof/>
+            <w:webHidden/>
+          </w:rPr>
+          <w:t>3</w:t>
+        </w:r>
+        <w:r>
+          <w:rPr>
+            <w:noProof/>
+            <w:webHidden/>
+          </w:rPr>
+          <w:fldChar w:fldCharType="end"/>
+        </w:r>
+      </w:hyperlink>
+    </w:p>
+    <w:p>
+      <w:pPr>
+        <w:pStyle w:val="TOC2"/>
+        <w:tabs>
+          <w:tab w:val="left" w:pos="960"/>
+          <w:tab w:val="right" w:leader="dot" w:pos="9350"/>
+        </w:tabs>
+        <w:rPr>
+          <w:rFonts w:asciiTheme="minorHAnsi" w:hAnsiTheme="minorHAnsi"/>
+          <w:noProof/>
+          <w:sz w:val="24"/>
+        </w:rPr>
+      </w:pPr>
+      <w:hyperlink w:anchor="_Toc229733054" w:history="1">
+        <w:r>
+          <w:rPr>
+            <w:rStyle w:val="Hyperlink"/>
+            <w:noProof/>
+          </w:rPr>
+          <w:t>3.5.</w:t>
+        </w:r>
+        <w:r>
+          <w:rPr>
+            <w:rFonts w:asciiTheme="minorHAnsi" w:hAnsiTheme="minorHAnsi"/>
+            <w:noProof/>
+            <w:sz w:val="24"/>
+          </w:rPr>
+          <w:tab/>
+        </w:r>
+        <w:r>
+          <w:rPr>
+            <w:rStyle w:val="Hyperlink"/>
+            <w:noProof/>
+          </w:rPr>
+          <w:t>Lỗi sai lệch thông số hoặc giao diện gọi hàm (Ví dụ: Sự kiện Tàu thăm dò Mars Orbiter năm 1999):</w:t>
+        </w:r>
+        <w:r>
+          <w:rPr>
+            <w:noProof/>
+            <w:webHidden/>
+          </w:rPr>
+          <w:tab/>
+        </w:r>
+        <w:r>
+          <w:rPr>
+            <w:noProof/>
+            <w:webHidden/>
+          </w:rPr>
+          <w:fldChar w:fldCharType="begin"/>
+        </w:r>
+        <w:r>
+          <w:rPr>
+            <w:noProof/>
+            <w:webHidden/>
+          </w:rPr>
+          <w:instrText xml:space="preserve"> PAGEREF _Toc229733054 \h </w:instrText>
+        </w:r>
+        <w:r>
+          <w:rPr>
+            <w:noProof/>
+            <w:webHidden/>
+          </w:rPr>
+        </w:r>
+        <w:r>
+          <w:rPr>
+            <w:noProof/>
+            <w:webHidden/>
+          </w:rPr>
+          <w:fldChar w:fldCharType="separate"/>
+        </w:r>
+        <w:r>
+          <w:rPr>
+            <w:noProof/>
+            <w:webHidden/>
+          </w:rPr>
+          <w:t>3</w:t>
+        </w:r>
+        <w:r>
+          <w:rPr>
+            <w:noProof/>
+            <w:webHidden/>
+          </w:rPr>
+          <w:fldChar w:fldCharType="end"/>
+        </w:r>
+      </w:hyperlink>
+    </w:p>
+    <w:p>
+      <w:pPr>
+        <w:pStyle w:val="TOC1"/>
+        <w:tabs>
+          <w:tab w:val="left" w:pos="522"/>
+          <w:tab w:val="right" w:leader="dot" w:pos="9350"/>
+        </w:tabs>
+        <w:rPr>
+          <w:rFonts w:asciiTheme="minorHAnsi" w:hAnsiTheme="minorHAnsi"/>
+          <w:noProof/>
+          <w:sz w:val="24"/>
+        </w:rPr>
+      </w:pPr>
+      <w:hyperlink w:anchor="_Toc229733055" w:history="1">
+        <w:r>
+          <w:rPr>
+            <w:rStyle w:val="Hyperlink"/>
+            <w:noProof/>
+          </w:rPr>
+          <w:t>4.</w:t>
+        </w:r>
+        <w:r>
+          <w:rPr>
+            <w:rFonts w:asciiTheme="minorHAnsi" w:hAnsiTheme="minorHAnsi"/>
+            <w:noProof/>
+            <w:sz w:val="24"/>
+          </w:rPr>
+          <w:tab/>
+        </w:r>
+        <w:r>
+          <w:rPr>
+            <w:rStyle w:val="Hyperlink"/>
+            <w:noProof/>
+          </w:rPr>
+          <w:t>Phân biệt Verification (Xác minh) và Validation (Xác nhận)</w:t>
+        </w:r>
+        <w:r>
+          <w:rPr>
+            <w:noProof/>
+            <w:webHidden/>
+          </w:rPr>
+          <w:tab/>
+        </w:r>
+        <w:r>
+          <w:rPr>
+            <w:noProof/>
+            <w:webHidden/>
+          </w:rPr>
+          <w:fldChar w:fldCharType="begin"/>
+        </w:r>
+        <w:r>
+          <w:rPr>
+            <w:noProof/>
+            <w:webHidden/>
+          </w:rPr>
+          <w:instrText xml:space="preserve"> PAGEREF _Toc229733055 \h </w:instrText>
+        </w:r>
+        <w:r>
+          <w:rPr>
+            <w:noProof/>
+            <w:webHidden/>
+          </w:rPr>
+        </w:r>
+        <w:r>
+          <w:rPr>
+            <w:noProof/>
+            <w:webHidden/>
+          </w:rPr>
+          <w:fldChar w:fldCharType="separate"/>
+        </w:r>
+        <w:r>
+          <w:rPr>
+            <w:noProof/>
+            <w:webHidden/>
+          </w:rPr>
+          <w:t>3</w:t>
+        </w:r>
+        <w:r>
+          <w:rPr>
+            <w:noProof/>
+            <w:webHidden/>
+          </w:rPr>
+          <w:fldChar w:fldCharType="end"/>
+        </w:r>
+      </w:hyperlink>
+    </w:p>
+    <w:p>
+      <w:pPr>
+        <w:pStyle w:val="TOC2"/>
+        <w:tabs>
+          <w:tab w:val="left" w:pos="960"/>
+          <w:tab w:val="right" w:leader="dot" w:pos="9350"/>
+        </w:tabs>
+        <w:rPr>
+          <w:rFonts w:asciiTheme="minorHAnsi" w:hAnsiTheme="minorHAnsi"/>
+          <w:noProof/>
+          <w:sz w:val="24"/>
+        </w:rPr>
+      </w:pPr>
+      <w:hyperlink w:anchor="_Toc229733056" w:history="1">
+        <w:r>
+          <w:rPr>
+            <w:rStyle w:val="Hyperlink"/>
+            <w:noProof/>
+          </w:rPr>
+          <w:t>4.1.</w:t>
+        </w:r>
+        <w:r>
+          <w:rPr>
+            <w:rFonts w:asciiTheme="minorHAnsi" w:hAnsiTheme="minorHAnsi"/>
+            <w:noProof/>
+            <w:sz w:val="24"/>
+          </w:rPr>
+          <w:tab/>
+        </w:r>
+        <w:r>
+          <w:rPr>
+            <w:rStyle w:val="Hyperlink"/>
+            <w:noProof/>
+          </w:rPr>
+          <w:t>Verification (Xác minh):</w:t>
+        </w:r>
+        <w:r>
+          <w:rPr>
+            <w:noProof/>
+            <w:webHidden/>
+          </w:rPr>
+          <w:tab/>
+        </w:r>
+        <w:r>
+          <w:rPr>
+            <w:noProof/>
+            <w:webHidden/>
+          </w:rPr>
+          <w:fldChar w:fldCharType="begin"/>
+        </w:r>
+        <w:r>
+          <w:rPr>
+            <w:noProof/>
+            <w:webHidden/>
+          </w:rPr>
+          <w:instrText xml:space="preserve"> PAGEREF _Toc229733056 \h </w:instrText>
+        </w:r>
+        <w:r>
+          <w:rPr>
+            <w:noProof/>
+            <w:webHidden/>
+          </w:rPr>
+        </w:r>
+        <w:r>
+          <w:rPr>
+            <w:noProof/>
+            <w:webHidden/>
+          </w:rPr>
+          <w:fldChar w:fldCharType="separate"/>
+        </w:r>
+        <w:r>
+          <w:rPr>
+            <w:noProof/>
+            <w:webHidden/>
+          </w:rPr>
+          <w:t>4</w:t>
+        </w:r>
+        <w:r>
+          <w:rPr>
+            <w:noProof/>
+            <w:webHidden/>
+          </w:rPr>
+          <w:fldChar w:fldCharType="end"/>
+        </w:r>
+      </w:hyperlink>
+    </w:p>
+    <w:p>
+      <w:pPr>
+        <w:pStyle w:val="TOC2"/>
+        <w:tabs>
+          <w:tab w:val="left" w:pos="960"/>
+          <w:tab w:val="right" w:leader="dot" w:pos="9350"/>
+        </w:tabs>
+        <w:rPr>
+          <w:rFonts w:asciiTheme="minorHAnsi" w:hAnsiTheme="minorHAnsi"/>
+          <w:noProof/>
+          <w:sz w:val="24"/>
+        </w:rPr>
+      </w:pPr>
+      <w:hyperlink w:anchor="_Toc229733057" w:history="1">
+        <w:r>
+          <w:rPr>
+            <w:rStyle w:val="Hyperlink"/>
+            <w:noProof/>
+          </w:rPr>
+          <w:t>4.2.</w:t>
+        </w:r>
+        <w:r>
+          <w:rPr>
+            <w:rFonts w:asciiTheme="minorHAnsi" w:hAnsiTheme="minorHAnsi"/>
+            <w:noProof/>
+            <w:sz w:val="24"/>
+          </w:rPr>
+          <w:tab/>
+        </w:r>
+        <w:r>
+          <w:rPr>
+            <w:rStyle w:val="Hyperlink"/>
+            <w:noProof/>
+          </w:rPr>
+          <w:t>Validation (</w:t>
+        </w:r>
+        <w:r>
+          <w:rPr>
+            <w:rStyle w:val="Hyperlink"/>
+            <w:noProof/>
+          </w:rPr>
+          <w:t>X</w:t>
+        </w:r>
+        <w:r>
+          <w:rPr>
+            <w:rStyle w:val="Hyperlink"/>
+            <w:noProof/>
+          </w:rPr>
+          <w:t>ác nhận):</w:t>
+        </w:r>
+        <w:r>
+          <w:rPr>
+            <w:noProof/>
+            <w:webHidden/>
+          </w:rPr>
+          <w:tab/>
+        </w:r>
+        <w:r>
+          <w:rPr>
+            <w:noProof/>
+            <w:webHidden/>
+          </w:rPr>
+          <w:fldChar w:fldCharType="begin"/>
+        </w:r>
+        <w:r>
+          <w:rPr>
+            <w:noProof/>
+            <w:webHidden/>
+          </w:rPr>
+          <w:instrText xml:space="preserve"> PAGEREF _Toc229733057 \h </w:instrText>
+        </w:r>
+        <w:r>
+          <w:rPr>
+            <w:noProof/>
+            <w:webHidden/>
+          </w:rPr>
+        </w:r>
+        <w:r>
+          <w:rPr>
+            <w:noProof/>
+            <w:webHidden/>
+          </w:rPr>
+          <w:fldChar w:fldCharType="separate"/>
+        </w:r>
+        <w:r>
+          <w:rPr>
+            <w:noProof/>
+            <w:webHidden/>
+          </w:rPr>
+          <w:t>4</w:t>
+        </w:r>
+        <w:r>
+          <w:rPr>
+            <w:noProof/>
+            <w:webHidden/>
+          </w:rPr>
+          <w:fldChar w:fldCharType="end"/>
+        </w:r>
+      </w:hyperlink>
+    </w:p>
+    <w:p>
+      <w:r>
+        <w:fldChar w:fldCharType="end"/>
+      </w:r>
+    </w:p>
+    <w:p>
+      <w:r>
+        <w:br w:type="page"/>
+      </w:r>
+    </w:p>
+    <w:p>
+      <w:pPr>
+        <w:pStyle w:val="TieuDe1"/>
+      </w:pPr>
+      <w:bookmarkStart w:id="0" w:name="_Toc229733043"/>
+      <w:r>
+        <w:lastRenderedPageBreak/>
+        <w:t>Kiểm thử phần mềm là gì?</w:t>
+      </w:r>
+      <w:bookmarkEnd w:id="0"/>
+      <w:r>
+        <w:t xml:space="preserve"> </w:t>
+      </w:r>
+    </w:p>
+    <w:p>
+      <w:pPr>
+        <w:pStyle w:val="0NoiDung"/>
+      </w:pPr>
+      <w:r>
+        <w:t>Kiểm thử phần mềm là một quá trình bao gồm tất cả các hoạt động trong vòng đời phát triển phần mềm, bao gồm cả kiểm thử tĩnh (static testing) và kiểm thử động (dynamic testing). Quá trình này liên quan đến việc lập kế hoạch, chuẩn bị và đánh giá các sản phẩm phần mềm cùng các sản phẩm liên quan để xác định xem chúng có đáp ứng các yêu cầu đã được chỉ định hay không, chứng minh rằng chúng phù hợp với mục đích sử dụng, và nhằm mục đích phát hiện ra các khiếm khuyết (defects). Kiểm thử không chỉ đơn thuần là việc chạy code mà còn bao gồm cả các hoạt động trước và sau khi thực thi như đánh giá tài liệu, phân tích mã nguồn và báo cáo kết quả.</w:t>
+      </w:r>
+    </w:p>
+    <w:p>
+      <w:pPr>
+        <w:pStyle w:val="TieuDe1"/>
+      </w:pPr>
+      <w:bookmarkStart w:id="1" w:name="_Toc229733044"/>
+      <w:r>
+        <w:t>Tại sao kiểm thử phần mềm là cần thiết?</w:t>
+      </w:r>
+      <w:bookmarkEnd w:id="1"/>
+      <w:r>
+        <w:t xml:space="preserve"> </w:t>
+      </w:r>
+    </w:p>
+    <w:p>
+      <w:pPr>
+        <w:pStyle w:val="0NoiDung"/>
+      </w:pPr>
+      <w:r>
+        <w:t>Bởi vì quá trình phát triển phần mềm được thực hiện bởi con người, mà con người thì có thể mắc sai lầm, từ đó tạo ra các khiếm khuyết (bugs/defects) trong hệ thống. Kiểm thử phần mềm là cần thiết vì những lý do sau:</w:t>
+      </w:r>
+    </w:p>
+    <w:p>
+      <w:pPr>
+        <w:pStyle w:val="TieuDe110"/>
+      </w:pPr>
+      <w:bookmarkStart w:id="2" w:name="_Toc229733045"/>
+      <w:r>
+        <w:rPr>
           <w:bCs/>
-          <w:noProof/>
         </w:rPr>
+        <w:t>Giảm thiểu rủi ro hỏng hóc (failures):</w:t>
+      </w:r>
+      <w:bookmarkEnd w:id="2"/>
+      <w:r>
+        <w:t xml:space="preserve"> </w:t>
+      </w:r>
+    </w:p>
+    <w:p>
+      <w:pPr>
+        <w:pStyle w:val="0NoiDung"/>
+      </w:pPr>
+      <w:r>
+        <w:t>Kiểm thử nghiêm ngặt giúp ngăn chặn các sự cố xuất hiện khi phần mềm được đưa vào sử dụng thực tế.</w:t>
+      </w:r>
+    </w:p>
+    <w:p>
+      <w:pPr>
+        <w:pStyle w:val="TieuDe110"/>
+      </w:pPr>
+      <w:bookmarkStart w:id="3" w:name="_Toc229733046"/>
+      <w:r>
+        <w:rPr>
+          <w:bCs/>
+        </w:rPr>
+        <w:t>Tiết kiệm thời gian và chi phí:</w:t>
+      </w:r>
+      <w:bookmarkEnd w:id="3"/>
+      <w:r>
+        <w:t xml:space="preserve"> </w:t>
+      </w:r>
+    </w:p>
+    <w:p>
+      <w:pPr>
+        <w:pStyle w:val="0NoiDung"/>
+      </w:pPr>
+      <w:r>
+        <w:t>Việc phát hiện lỗi ngay từ các giai đoạn sớm (ví dụ như rà soát yêu cầu hệ thống hoặc thiết kế) giúp tránh được việc xây dựng sai phần mềm, giảm chi phí sửa chữa muộn.</w:t>
+      </w:r>
+    </w:p>
+    <w:p>
+      <w:pPr>
+        <w:pStyle w:val="TieuDe110"/>
+      </w:pPr>
+      <w:bookmarkStart w:id="4" w:name="_Toc229733047"/>
+      <w:r>
+        <w:t>Đảm bảo chất lượng và sự hài lòng của các bên liên quan:</w:t>
+      </w:r>
+      <w:bookmarkEnd w:id="4"/>
+      <w:r>
+        <w:t xml:space="preserve"> </w:t>
+      </w:r>
+    </w:p>
+    <w:p>
+      <w:pPr>
+        <w:pStyle w:val="0NoiDung"/>
+      </w:pPr>
+      <w:r>
+        <w:t>Nó xác minh và xác nhận phần mềm không chỉ được xây dựng đúng theo đặc tả mà còn đáp ứng được kỳ vọng thực tế của người dùng.</w:t>
+      </w:r>
+    </w:p>
+    <w:p>
+      <w:pPr>
+        <w:pStyle w:val="TieuDe110"/>
+      </w:pPr>
+      <w:bookmarkStart w:id="5" w:name="_Toc229733048"/>
+      <w:r>
+        <w:t>Tuân thủ tiêu chuẩn và pháp luật:</w:t>
+      </w:r>
+      <w:bookmarkEnd w:id="5"/>
+      <w:r>
+        <w:t xml:space="preserve"> </w:t>
+      </w:r>
+    </w:p>
+    <w:p>
+      <w:pPr>
+        <w:pStyle w:val="0NoiDung"/>
+      </w:pPr>
+      <w:r>
+        <w:t>Đối với một số ngành đặc thù (như thiết bị y tế hay xe tự lái), kiểm thử là bắt buộc để đáp ứng các quy định của hợp đồng, tiêu chuẩn pháp lý hoặc các tiêu chuẩn khắt khe của ngành.</w:t>
+      </w:r>
+    </w:p>
+    <w:p>
+      <w:pPr>
+        <w:pStyle w:val="TieuDe1"/>
+      </w:pPr>
+      <w:bookmarkStart w:id="6" w:name="_Toc229733049"/>
+      <w:r>
+        <w:t>5 ví dụ về lỗi phần mềm và tác động của chúng:</w:t>
+      </w:r>
+      <w:bookmarkEnd w:id="6"/>
+    </w:p>
+    <w:p>
+      <w:pPr>
+        <w:pStyle w:val="TieuDe110"/>
+      </w:pPr>
+      <w:bookmarkStart w:id="7" w:name="_Toc229733050"/>
+      <w:r>
+        <w:t>Ứng dụng bị dừng đột ngột hoặc web bị treo khi đang thanh toán:</w:t>
+      </w:r>
+      <w:bookmarkEnd w:id="7"/>
+      <w:r>
+        <w:t xml:space="preserve"> </w:t>
+      </w:r>
+    </w:p>
+    <w:p>
+      <w:pPr>
+        <w:pStyle w:val="0NoiDung"/>
+      </w:pPr>
+      <w:r>
+        <w:t>Tác động của lỗi này gây ra sự phiền toái, làm lãng phí thời gian của người dùng, đồng thời công ty có thể bị tổn thất tài chính và suy giảm uy tín kinh doanh.</w:t>
+      </w:r>
+    </w:p>
+    <w:p>
+      <w:pPr>
+        <w:pStyle w:val="TieuDe110"/>
+      </w:pPr>
+      <w:bookmarkStart w:id="8" w:name="_Toc229733051"/>
+      <w:r>
+        <w:rPr>
+          <w:bCs/>
+        </w:rPr>
+        <w:t>Giá cả không nhất quán đối với cùng một chuyến bay trên các trang web du lịch:</w:t>
+      </w:r>
+      <w:bookmarkEnd w:id="8"/>
+      <w:r>
+        <w:t xml:space="preserve"> </w:t>
+      </w:r>
+    </w:p>
+    <w:p>
+      <w:pPr>
+        <w:pStyle w:val="0NoiDung"/>
+      </w:pPr>
+      <w:r>
+        <w:t>Việc hiển thị sai hoặc không đồng bộ giá cả cũng gây ảnh hưởng trực tiếp tới tài chính và độ tin cậy của dịch vụ.</w:t>
+      </w:r>
+    </w:p>
+    <w:p>
+      <w:pPr>
+        <w:pStyle w:val="TieuDe110"/>
+      </w:pPr>
+      <w:bookmarkStart w:id="9" w:name="_Toc229733052"/>
+      <w:r>
+        <w:lastRenderedPageBreak/>
+        <w:t>Lỗi phần mềm trong các hệ thống an toàn trọng yếu (như thiết bị y tế, xe tự lái):</w:t>
+      </w:r>
+      <w:bookmarkEnd w:id="9"/>
+    </w:p>
+    <w:p>
+      <w:pPr>
+        <w:pStyle w:val="0NoiDung"/>
+      </w:pPr>
+      <w:r>
+        <w:t>Lỗi trong các môi trường này có tác động cực kỳ nghiêm trọng, vì chúng có thể đe dọa trực tiếp đến tính mạng con người, gây chấn thương hoặc thậm chí là tử vong.</w:t>
+      </w:r>
+    </w:p>
+    <w:p>
+      <w:pPr>
+        <w:pStyle w:val="TieuDe110"/>
+      </w:pPr>
+      <w:bookmarkStart w:id="10" w:name="_Toc229733053"/>
+      <w:r>
+        <w:t>Phân tích viên kinh doanh định nghĩa sai sức chịu tải của hệ thống:</w:t>
+      </w:r>
+      <w:bookmarkEnd w:id="10"/>
+      <w:r>
+        <w:t xml:space="preserve"> </w:t>
+      </w:r>
+    </w:p>
+    <w:p>
+      <w:pPr>
+        <w:pStyle w:val="0NoiDung"/>
+      </w:pPr>
+      <w:r>
+        <w:t>Một hệ thống thương mại điện tử cần hỗ trợ 1.000 người dùng đồng thời, nhưng nếu yêu cầu đưa ra bị lỗi chỉ ghi 100 người, hệ thống sẽ bị cạn kiệt tài nguyên khi đạt mức tải thực tế. Điều này tác động trực tiếp đến thời gian phản hồi và làm hỏng độ tin cậy của phần mềm.</w:t>
+      </w:r>
+    </w:p>
+    <w:p>
+      <w:pPr>
+        <w:pStyle w:val="TieuDe110"/>
+      </w:pPr>
+      <w:bookmarkStart w:id="11" w:name="_Toc229733054"/>
+      <w:r>
+        <w:t>Lỗi sai lệch thông số hoặc giao diện gọi hàm (Ví dụ: Sự kiện Tàu thăm dò Mars Orbiter năm 1999):</w:t>
+      </w:r>
+      <w:bookmarkEnd w:id="11"/>
+      <w:r>
+        <w:t xml:space="preserve"> </w:t>
+      </w:r>
+    </w:p>
+    <w:p>
+      <w:pPr>
+        <w:pStyle w:val="0NoiDung"/>
+      </w:pPr>
+      <w:r>
+        <w:t>Sự cố xảy ra khi một hệ thống gọi sử dụng hệ đo lường Anh trong khi hệ thống được gọi lại sử dụng hệ mét. Lỗi không đồng nhất đơn vị này đã tác động tàn khốc, làm cho tàu thăm dò bị cháy rụi trong khí quyển, phá hủy hoàn toàn cả một chiến dịch đắt đỏ.</w:t>
+      </w:r>
+    </w:p>
+    <w:p>
+      <w:pPr>
+        <w:pStyle w:val="TieuDe1"/>
+      </w:pPr>
+      <w:bookmarkStart w:id="12" w:name="_Toc229733055"/>
+      <w:r>
+        <w:t>Phân biệt Verification (Xác minh) và Validation (Xác nhận)</w:t>
+      </w:r>
+      <w:bookmarkEnd w:id="12"/>
+      <w:r>
+        <w:t xml:space="preserve"> </w:t>
+      </w:r>
+    </w:p>
+    <w:p>
+      <w:pPr>
+        <w:pStyle w:val="0NoiDung"/>
+      </w:pPr>
+      <w:r>
+        <w:t>Mặc dù đều nhằm mục đích đánh giá hệ thống, nhưng hai khái niệm này trả lời cho hai câu hỏi hoàn toàn khác nhau:</w:t>
+      </w:r>
+    </w:p>
+    <w:p>
+      <w:pPr>
+        <w:pStyle w:val="TieuDe110"/>
+      </w:pPr>
+      <w:bookmarkStart w:id="13" w:name="_Toc229733056"/>
+      <w:r>
+        <w:t>Verification (Xác minh):</w:t>
+      </w:r>
+      <w:bookmarkEnd w:id="13"/>
+      <w:r>
+        <w:t xml:space="preserve"> </w:t>
+      </w:r>
+    </w:p>
+    <w:p>
+      <w:pPr>
+        <w:pStyle w:val="0NoiDung"/>
+      </w:pPr>
+      <w:r>
+        <w:t>Tập trung vào câu hỏi "Chúng ta đã xây dựng hệ thống đúng kỹ thuật chưa?" ("Have we built the system correctly?"). Nó là việc kiểm tra để đánh giá xem một sản phẩm công việc, thành phần hay hệ thống có tuân thủ và đáp ứng đúng với các yêu cầu đã được chỉ định (đặc tả) hay không.</w:t>
+      </w:r>
+    </w:p>
+    <w:p>
+      <w:pPr>
+        <w:pStyle w:val="TieuDe110"/>
+      </w:pPr>
+      <w:bookmarkStart w:id="14" w:name="_Toc229733057"/>
+      <w:r>
         <w:t>Validation (Xác nhận):</w:t>
       </w:r>
-      <w:r>
-        <w:rPr>
-          <w:noProof/>
-        </w:rPr>
-        <w:t xml:space="preserve"> Tập trung vào câu hỏi </w:t>
-      </w:r>
-      <w:r>
-        <w:rPr>
-          <w:b/>
-          <w:bCs/>
-          <w:noProof/>
-        </w:rPr>
-        <w:t>"Chúng ta có đang xây dựng đúng hệ thống mà người dùng cần không?"</w:t>
-      </w:r>
-      <w:r>
-        <w:rPr>
-          <w:noProof/>
-        </w:rPr>
-        <w:t xml:space="preserve"> ("Have we built the right system?"). Đây là quá trình kiểm tra để đảm bảo rằng phần mềm khi giao cho khách hàng sẽ thực sự hoạt động hiệu quả trong môi trường thực tế, </w:t>
-      </w:r>
-      <w:r>
-        <w:rPr>
-          <w:b/>
-          <w:bCs/>
-          <w:noProof/>
-        </w:rPr>
-        <w:t>đáp ứng được nhu cầu, mong muốn của người dùng</w:t>
-      </w:r>
-      <w:r>
-        <w:rPr>
-          <w:noProof/>
-        </w:rPr>
-        <w:t xml:space="preserve"> và giải quyết được vấn đề thực tế (phù hợp với mục đích sử dụng - fit for purpose).</w:t>
-      </w:r>
-    </w:p>
-    <w:p>
-      <w:pPr>
-        <w:ind w:left="360"/>
-        <w:rPr>
-          <w:noProof/>
-        </w:rPr>
-      </w:pPr>
+      <w:bookmarkEnd w:id="14"/>
+      <w:r>
+        <w:t xml:space="preserve"> </w:t>
+      </w:r>
+    </w:p>
+    <w:p>
+      <w:pPr>
+        <w:pStyle w:val="0NoiDung"/>
+      </w:pPr>
+      <w:r>
+        <w:t>Tập trung vào câu hỏi "Chúng ta có đang xây dựng đúng hệ thống mà người dùng cần không?" ("Have we built the right system?"). Đây là quá trình kiểm tra để đảm bảo rằng phần mềm khi giao cho khách hàng sẽ thực sự hoạt động hiệu quả trong môi trường thực tế, đáp ứng được nhu cầu, mong muốn của người dùng và giải quyết được vấn đề thực tế (phù hợp với mục đích sử dụng - fit for purpose).</w:t>
+      </w:r>
     </w:p>
     <w:sectPr>
       <w:pgSz w:w="12240" w:h="15840"/>
@@ -466,211 +1688,120 @@
 <file path=word/numbering.xml><?xml version="1.0" encoding="utf-8"?>
 <w:numbering xmlns:wpc="http://schemas.microsoft.com/office/word/2010/wordprocessingCanvas" xmlns:cx="http://schemas.microsoft.com/office/drawing/2014/chartex" xmlns:cx1="http://schemas.microsoft.com/office/drawing/2015/9/8/chartex" xmlns:cx2="http://schemas.microsoft.com/office/drawing/2015/10/21/chartex" xmlns:cx3="http://schemas.microsoft.com/office/drawing/2016/5/9/chartex" xmlns:cx4="http://schemas.microsoft.com/office/drawing/2016/5/10/chartex" xmlns:cx5="http://schemas.microsoft.com/office/drawing/2016/5/11/chartex" xmlns:cx6="http://schemas.microsoft.com/office/drawing/2016/5/12/chartex" xmlns:cx7="http://schemas.microsoft.com/office/drawing/2016/5/13/chartex" xmlns:cx8="http://schemas.microsoft.com/office/drawing/2016/5/14/chartex" xmlns:mc="http://schemas.openxmlformats.org/markup-compatibility/2006" xmlns:aink="http://schemas.microsoft.com/office/drawing/2016/ink" xmlns:am3d="http://schemas.microsoft.com/office/drawing/2017/model3d" xmlns:o="urn:schemas-microsoft-com:office:office" xmlns:oel="http://schemas.microsoft.com/office/2019/extlst" xmlns:r="http://schemas.openxmlformats.org/officeDocument/2006/relationships" xmlns:m="http://schemas.openxmlformats.org/officeDocument/2006/math" xmlns:v="urn:schemas-microsoft-com:vml" xmlns:wp14="http://schemas.microsoft.com/office/word/2010/wordprocessingDrawing" xmlns:wp="http://schemas.openxmlformats.org/drawingml/2006/wordprocessingDrawing" xmlns:w10="urn:schemas-microsoft-com:office:word" xmlns:w="http://schemas.openxmlformats.org/wordprocessingml/2006/main" xmlns:w14="http://schemas.microsoft.com/office/word/2010/wordml" xmlns:w15="http://schemas.microsoft.com/office/word/2012/wordml" xmlns:w16cex="http://schemas.microsoft.com/office/word/2018/wordml/cex" xmlns:w16cid="http://schemas.microsoft.com/office/word/2016/wordml/cid" xmlns:w16="http://schemas.microsoft.com/office/word/2018/wordml" xmlns:w16du="http://schemas.microsoft.com/office/word/2023/wordml/word16du" xmlns:w16sdtdh="http://schemas.microsoft.com/office/word/2020/wordml/sdtdatahash" xmlns:w16sdtfl="http://schemas.microsoft.com/office/word/2024/wordml/sdtformatlock" xmlns:w16se="http://schemas.microsoft.com/office/word/2015/wordml/symex" xmlns:wpg="http://schemas.microsoft.com/office/word/2010/wordprocessingGroup" xmlns:wpi="http://schemas.microsoft.com/office/word/2010/wordprocessingInk" xmlns:wne="http://schemas.microsoft.com/office/word/2006/wordml" xmlns:wps="http://schemas.microsoft.com/office/word/2010/wordprocessingShape" mc:Ignorable="w14 w15 w16se w16cid w16 w16cex w16sdtdh w16sdtfl w16du wp14">
   <w:abstractNum w:abstractNumId="0" w15:restartNumberingAfterBreak="0">
-    <w:nsid w:val="13100CEC"/>
+    <w:nsid w:val="1FC03325"/>
     <w:multiLevelType w:val="multilevel"/>
-    <w:tmpl w:val="ECB0B87A"/>
+    <w:tmpl w:val="E9504D88"/>
     <w:lvl w:ilvl="0">
       <w:start w:val="1"/>
       <w:numFmt w:val="decimal"/>
       <w:lvlText w:val="%1."/>
       <w:lvlJc w:val="left"/>
       <w:pPr>
-        <w:tabs>
-          <w:tab w:val="num" w:pos="720"/>
-        </w:tabs>
-        <w:ind w:left="720" w:hanging="360"/>
-      </w:pPr>
-    </w:lvl>
-    <w:lvl w:ilvl="1" w:tentative="1">
-      <w:start w:val="1"/>
-      <w:numFmt w:val="decimal"/>
-      <w:lvlText w:val="%2."/>
-      <w:lvlJc w:val="left"/>
-      <w:pPr>
-        <w:tabs>
-          <w:tab w:val="num" w:pos="1440"/>
-        </w:tabs>
-        <w:ind w:left="1440" w:hanging="360"/>
-      </w:pPr>
-    </w:lvl>
-    <w:lvl w:ilvl="2" w:tentative="1">
-      <w:start w:val="1"/>
-      <w:numFmt w:val="decimal"/>
-      <w:lvlText w:val="%3."/>
-      <w:lvlJc w:val="left"/>
-      <w:pPr>
-        <w:tabs>
-          <w:tab w:val="num" w:pos="2160"/>
-        </w:tabs>
-        <w:ind w:left="2160" w:hanging="360"/>
-      </w:pPr>
-    </w:lvl>
-    <w:lvl w:ilvl="3" w:tentative="1">
-      <w:start w:val="1"/>
-      <w:numFmt w:val="decimal"/>
-      <w:lvlText w:val="%4."/>
-      <w:lvlJc w:val="left"/>
-      <w:pPr>
-        <w:tabs>
-          <w:tab w:val="num" w:pos="2880"/>
-        </w:tabs>
-        <w:ind w:left="2880" w:hanging="360"/>
-      </w:pPr>
-    </w:lvl>
-    <w:lvl w:ilvl="4" w:tentative="1">
-      <w:start w:val="1"/>
-      <w:numFmt w:val="decimal"/>
-      <w:lvlText w:val="%5."/>
-      <w:lvlJc w:val="left"/>
-      <w:pPr>
-        <w:tabs>
-          <w:tab w:val="num" w:pos="3600"/>
-        </w:tabs>
-        <w:ind w:left="3600" w:hanging="360"/>
-      </w:pPr>
-    </w:lvl>
-    <w:lvl w:ilvl="5" w:tentative="1">
-      <w:start w:val="1"/>
-      <w:numFmt w:val="decimal"/>
-      <w:lvlText w:val="%6."/>
-      <w:lvlJc w:val="left"/>
-      <w:pPr>
-        <w:tabs>
-          <w:tab w:val="num" w:pos="4320"/>
-        </w:tabs>
-        <w:ind w:left="4320" w:hanging="360"/>
-      </w:pPr>
-    </w:lvl>
-    <w:lvl w:ilvl="6" w:tentative="1">
-      <w:start w:val="1"/>
-      <w:numFmt w:val="decimal"/>
-      <w:lvlText w:val="%7."/>
-      <w:lvlJc w:val="left"/>
-      <w:pPr>
-        <w:tabs>
-          <w:tab w:val="num" w:pos="5040"/>
-        </w:tabs>
-        <w:ind w:left="5040" w:hanging="360"/>
-      </w:pPr>
-    </w:lvl>
-    <w:lvl w:ilvl="7" w:tentative="1">
-      <w:start w:val="1"/>
-      <w:numFmt w:val="decimal"/>
-      <w:lvlText w:val="%8."/>
-      <w:lvlJc w:val="left"/>
-      <w:pPr>
-        <w:tabs>
-          <w:tab w:val="num" w:pos="5760"/>
-        </w:tabs>
-        <w:ind w:left="5760" w:hanging="360"/>
-      </w:pPr>
-    </w:lvl>
-    <w:lvl w:ilvl="8" w:tentative="1">
-      <w:start w:val="1"/>
-      <w:numFmt w:val="decimal"/>
-      <w:lvlText w:val="%9."/>
-      <w:lvlJc w:val="left"/>
-      <w:pPr>
-        <w:tabs>
-          <w:tab w:val="num" w:pos="6480"/>
-        </w:tabs>
-        <w:ind w:left="6480" w:hanging="360"/>
-      </w:pPr>
-    </w:lvl>
-  </w:abstractNum>
-  <w:abstractNum w:abstractNumId="1" w15:restartNumberingAfterBreak="0">
-    <w:nsid w:val="1D5A30D4"/>
-    <w:multiLevelType w:val="hybridMultilevel"/>
-    <w:tmpl w:val="52C83526"/>
-    <w:lvl w:ilvl="0" w:tplc="0409000F">
-      <w:start w:val="1"/>
-      <w:numFmt w:val="decimal"/>
-      <w:lvlText w:val="%1."/>
-      <w:lvlJc w:val="left"/>
-      <w:pPr>
-        <w:ind w:left="720" w:hanging="360"/>
+        <w:ind w:left="360" w:hanging="360"/>
       </w:pPr>
       <w:rPr>
         <w:rFonts w:hint="default"/>
       </w:rPr>
     </w:lvl>
-    <w:lvl w:ilvl="1" w:tplc="04090019" w:tentative="1">
+    <w:lvl w:ilvl="1">
+      <w:start w:val="1"/>
+      <w:numFmt w:val="decimal"/>
+      <w:lvlText w:val="%2."/>
+      <w:lvlJc w:val="left"/>
+      <w:pPr>
+        <w:ind w:left="720" w:hanging="360"/>
+      </w:pPr>
+    </w:lvl>
+    <w:lvl w:ilvl="2">
+      <w:start w:val="1"/>
+      <w:numFmt w:val="lowerRoman"/>
+      <w:lvlText w:val="%3)"/>
+      <w:lvlJc w:val="left"/>
+      <w:pPr>
+        <w:ind w:left="1080" w:hanging="360"/>
+      </w:pPr>
+      <w:rPr>
+        <w:rFonts w:hint="default"/>
+      </w:rPr>
+    </w:lvl>
+    <w:lvl w:ilvl="3">
+      <w:start w:val="1"/>
+      <w:numFmt w:val="decimal"/>
+      <w:pStyle w:val="TIeuDe11"/>
+      <w:lvlText w:val="(%4)"/>
+      <w:lvlJc w:val="left"/>
+      <w:pPr>
+        <w:ind w:left="1440" w:hanging="360"/>
+      </w:pPr>
+      <w:rPr>
+        <w:rFonts w:hint="default"/>
+      </w:rPr>
+    </w:lvl>
+    <w:lvl w:ilvl="4">
       <w:start w:val="1"/>
       <w:numFmt w:val="lowerLetter"/>
-      <w:lvlText w:val="%2."/>
-      <w:lvlJc w:val="left"/>
-      <w:pPr>
-        <w:ind w:left="1440" w:hanging="360"/>
-      </w:pPr>
-    </w:lvl>
-    <w:lvl w:ilvl="2" w:tplc="0409001B" w:tentative="1">
+      <w:lvlText w:val="(%5)"/>
+      <w:lvlJc w:val="left"/>
+      <w:pPr>
+        <w:ind w:left="1800" w:hanging="360"/>
+      </w:pPr>
+      <w:rPr>
+        <w:rFonts w:hint="default"/>
+      </w:rPr>
+    </w:lvl>
+    <w:lvl w:ilvl="5">
       <w:start w:val="1"/>
       <w:numFmt w:val="lowerRoman"/>
-      <w:lvlText w:val="%3."/>
-      <w:lvlJc w:val="right"/>
-      <w:pPr>
-        <w:ind w:left="2160" w:hanging="180"/>
-      </w:pPr>
-    </w:lvl>
-    <w:lvl w:ilvl="3" w:tplc="0409000F" w:tentative="1">
-      <w:start w:val="1"/>
-      <w:numFmt w:val="decimal"/>
-      <w:lvlText w:val="%4."/>
-      <w:lvlJc w:val="left"/>
-      <w:pPr>
-        <w:ind w:left="2880" w:hanging="360"/>
-      </w:pPr>
-    </w:lvl>
-    <w:lvl w:ilvl="4" w:tplc="04090019" w:tentative="1">
-      <w:start w:val="1"/>
-      <w:numFmt w:val="lowerLetter"/>
-      <w:lvlText w:val="%5."/>
-      <w:lvlJc w:val="left"/>
-      <w:pPr>
-        <w:ind w:left="3600" w:hanging="360"/>
-      </w:pPr>
-    </w:lvl>
-    <w:lvl w:ilvl="5" w:tplc="0409001B" w:tentative="1">
-      <w:start w:val="1"/>
-      <w:numFmt w:val="lowerRoman"/>
-      <w:lvlText w:val="%6."/>
-      <w:lvlJc w:val="right"/>
-      <w:pPr>
-        <w:ind w:left="4320" w:hanging="180"/>
-      </w:pPr>
-    </w:lvl>
-    <w:lvl w:ilvl="6" w:tplc="0409000F" w:tentative="1">
+      <w:lvlText w:val="(%6)"/>
+      <w:lvlJc w:val="left"/>
+      <w:pPr>
+        <w:ind w:left="2160" w:hanging="360"/>
+      </w:pPr>
+      <w:rPr>
+        <w:rFonts w:hint="default"/>
+      </w:rPr>
+    </w:lvl>
+    <w:lvl w:ilvl="6">
       <w:start w:val="1"/>
       <w:numFmt w:val="decimal"/>
       <w:lvlText w:val="%7."/>
       <w:lvlJc w:val="left"/>
       <w:pPr>
-        <w:ind w:left="5040" w:hanging="360"/>
-      </w:pPr>
-    </w:lvl>
-    <w:lvl w:ilvl="7" w:tplc="04090019" w:tentative="1">
+        <w:ind w:left="2520" w:hanging="360"/>
+      </w:pPr>
+      <w:rPr>
+        <w:rFonts w:hint="default"/>
+      </w:rPr>
+    </w:lvl>
+    <w:lvl w:ilvl="7">
       <w:start w:val="1"/>
       <w:numFmt w:val="lowerLetter"/>
       <w:lvlText w:val="%8."/>
       <w:lvlJc w:val="left"/>
       <w:pPr>
-        <w:ind w:left="5760" w:hanging="360"/>
-      </w:pPr>
-    </w:lvl>
-    <w:lvl w:ilvl="8" w:tplc="0409001B" w:tentative="1">
+        <w:ind w:left="2880" w:hanging="360"/>
+      </w:pPr>
+      <w:rPr>
+        <w:rFonts w:hint="default"/>
+      </w:rPr>
+    </w:lvl>
+    <w:lvl w:ilvl="8">
       <w:start w:val="1"/>
       <w:numFmt w:val="lowerRoman"/>
       <w:lvlText w:val="%9."/>
-      <w:lvlJc w:val="right"/>
-      <w:pPr>
-        <w:ind w:left="6480" w:hanging="180"/>
-      </w:pPr>
+      <w:lvlJc w:val="left"/>
+      <w:pPr>
+        <w:ind w:left="3240" w:hanging="360"/>
+      </w:pPr>
+      <w:rPr>
+        <w:rFonts w:hint="default"/>
+      </w:rPr>
     </w:lvl>
   </w:abstractNum>
-  <w:abstractNum w:abstractNumId="2" w15:restartNumberingAfterBreak="0">
-    <w:nsid w:val="1FC74E5F"/>
+  <w:abstractNum w:abstractNumId="1" w15:restartNumberingAfterBreak="0">
+    <w:nsid w:val="323C646F"/>
     <w:multiLevelType w:val="multilevel"/>
-    <w:tmpl w:val="BC045B66"/>
+    <w:tmpl w:val="624679BA"/>
     <w:lvl w:ilvl="0">
       <w:start w:val="1"/>
       <w:numFmt w:val="bullet"/>
@@ -816,10 +1947,123 @@
       </w:rPr>
     </w:lvl>
   </w:abstractNum>
+  <w:abstractNum w:abstractNumId="2" w15:restartNumberingAfterBreak="0">
+    <w:nsid w:val="3AF16552"/>
+    <w:multiLevelType w:val="multilevel"/>
+    <w:tmpl w:val="71F8B7E2"/>
+    <w:lvl w:ilvl="0">
+      <w:start w:val="1"/>
+      <w:numFmt w:val="decimal"/>
+      <w:lvlText w:val="%1."/>
+      <w:lvlJc w:val="left"/>
+      <w:pPr>
+        <w:tabs>
+          <w:tab w:val="num" w:pos="720"/>
+        </w:tabs>
+        <w:ind w:left="720" w:hanging="360"/>
+      </w:pPr>
+    </w:lvl>
+    <w:lvl w:ilvl="1" w:tentative="1">
+      <w:start w:val="1"/>
+      <w:numFmt w:val="decimal"/>
+      <w:lvlText w:val="%2."/>
+      <w:lvlJc w:val="left"/>
+      <w:pPr>
+        <w:tabs>
+          <w:tab w:val="num" w:pos="1440"/>
+        </w:tabs>
+        <w:ind w:left="1440" w:hanging="360"/>
+      </w:pPr>
+    </w:lvl>
+    <w:lvl w:ilvl="2" w:tentative="1">
+      <w:start w:val="1"/>
+      <w:numFmt w:val="decimal"/>
+      <w:lvlText w:val="%3."/>
+      <w:lvlJc w:val="left"/>
+      <w:pPr>
+        <w:tabs>
+          <w:tab w:val="num" w:pos="2160"/>
+        </w:tabs>
+        <w:ind w:left="2160" w:hanging="360"/>
+      </w:pPr>
+    </w:lvl>
+    <w:lvl w:ilvl="3" w:tentative="1">
+      <w:start w:val="1"/>
+      <w:numFmt w:val="decimal"/>
+      <w:lvlText w:val="%4."/>
+      <w:lvlJc w:val="left"/>
+      <w:pPr>
+        <w:tabs>
+          <w:tab w:val="num" w:pos="2880"/>
+        </w:tabs>
+        <w:ind w:left="2880" w:hanging="360"/>
+      </w:pPr>
+    </w:lvl>
+    <w:lvl w:ilvl="4" w:tentative="1">
+      <w:start w:val="1"/>
+      <w:numFmt w:val="decimal"/>
+      <w:lvlText w:val="%5."/>
+      <w:lvlJc w:val="left"/>
+      <w:pPr>
+        <w:tabs>
+          <w:tab w:val="num" w:pos="3600"/>
+        </w:tabs>
+        <w:ind w:left="3600" w:hanging="360"/>
+      </w:pPr>
+    </w:lvl>
+    <w:lvl w:ilvl="5" w:tentative="1">
+      <w:start w:val="1"/>
+      <w:numFmt w:val="decimal"/>
+      <w:lvlText w:val="%6."/>
+      <w:lvlJc w:val="left"/>
+      <w:pPr>
+        <w:tabs>
+          <w:tab w:val="num" w:pos="4320"/>
+        </w:tabs>
+        <w:ind w:left="4320" w:hanging="360"/>
+      </w:pPr>
+    </w:lvl>
+    <w:lvl w:ilvl="6" w:tentative="1">
+      <w:start w:val="1"/>
+      <w:numFmt w:val="decimal"/>
+      <w:lvlText w:val="%7."/>
+      <w:lvlJc w:val="left"/>
+      <w:pPr>
+        <w:tabs>
+          <w:tab w:val="num" w:pos="5040"/>
+        </w:tabs>
+        <w:ind w:left="5040" w:hanging="360"/>
+      </w:pPr>
+    </w:lvl>
+    <w:lvl w:ilvl="7" w:tentative="1">
+      <w:start w:val="1"/>
+      <w:numFmt w:val="decimal"/>
+      <w:lvlText w:val="%8."/>
+      <w:lvlJc w:val="left"/>
+      <w:pPr>
+        <w:tabs>
+          <w:tab w:val="num" w:pos="5760"/>
+        </w:tabs>
+        <w:ind w:left="5760" w:hanging="360"/>
+      </w:pPr>
+    </w:lvl>
+    <w:lvl w:ilvl="8" w:tentative="1">
+      <w:start w:val="1"/>
+      <w:numFmt w:val="decimal"/>
+      <w:lvlText w:val="%9."/>
+      <w:lvlJc w:val="left"/>
+      <w:pPr>
+        <w:tabs>
+          <w:tab w:val="num" w:pos="6480"/>
+        </w:tabs>
+        <w:ind w:left="6480" w:hanging="360"/>
+      </w:pPr>
+    </w:lvl>
+  </w:abstractNum>
   <w:abstractNum w:abstractNumId="3" w15:restartNumberingAfterBreak="0">
-    <w:nsid w:val="67C25C4B"/>
+    <w:nsid w:val="48A40DEA"/>
     <w:multiLevelType w:val="multilevel"/>
-    <w:tmpl w:val="D0608D30"/>
+    <w:tmpl w:val="0388F632"/>
     <w:lvl w:ilvl="0">
       <w:start w:val="1"/>
       <w:numFmt w:val="bullet"/>
@@ -966,107 +2210,134 @@
     </w:lvl>
   </w:abstractNum>
   <w:abstractNum w:abstractNumId="4" w15:restartNumberingAfterBreak="0">
-    <w:nsid w:val="7EAB32F6"/>
-    <w:multiLevelType w:val="hybridMultilevel"/>
-    <w:tmpl w:val="D16477E8"/>
-    <w:lvl w:ilvl="0" w:tplc="0409000F">
+    <w:nsid w:val="6EDA02D3"/>
+    <w:multiLevelType w:val="multilevel"/>
+    <w:tmpl w:val="03320290"/>
+    <w:lvl w:ilvl="0">
       <w:start w:val="1"/>
       <w:numFmt w:val="decimal"/>
+      <w:pStyle w:val="TieuDe1"/>
       <w:lvlText w:val="%1."/>
       <w:lvlJc w:val="left"/>
       <w:pPr>
-        <w:ind w:left="720" w:hanging="360"/>
+        <w:ind w:left="360" w:hanging="360"/>
       </w:pPr>
       <w:rPr>
         <w:rFonts w:hint="default"/>
       </w:rPr>
     </w:lvl>
-    <w:lvl w:ilvl="1" w:tplc="04090019" w:tentative="1">
-      <w:start w:val="1"/>
-      <w:numFmt w:val="lowerLetter"/>
-      <w:lvlText w:val="%2."/>
-      <w:lvlJc w:val="left"/>
-      <w:pPr>
-        <w:ind w:left="1440" w:hanging="360"/>
-      </w:pPr>
-    </w:lvl>
-    <w:lvl w:ilvl="2" w:tplc="0409001B" w:tentative="1">
-      <w:start w:val="1"/>
-      <w:numFmt w:val="lowerRoman"/>
-      <w:lvlText w:val="%3."/>
-      <w:lvlJc w:val="right"/>
-      <w:pPr>
-        <w:ind w:left="2160" w:hanging="180"/>
-      </w:pPr>
-    </w:lvl>
-    <w:lvl w:ilvl="3" w:tplc="0409000F" w:tentative="1">
+    <w:lvl w:ilvl="1">
       <w:start w:val="1"/>
       <w:numFmt w:val="decimal"/>
-      <w:lvlText w:val="%4."/>
-      <w:lvlJc w:val="left"/>
-      <w:pPr>
-        <w:ind w:left="2880" w:hanging="360"/>
-      </w:pPr>
-    </w:lvl>
-    <w:lvl w:ilvl="4" w:tplc="04090019" w:tentative="1">
-      <w:start w:val="1"/>
-      <w:numFmt w:val="lowerLetter"/>
-      <w:lvlText w:val="%5."/>
-      <w:lvlJc w:val="left"/>
-      <w:pPr>
-        <w:ind w:left="3600" w:hanging="360"/>
-      </w:pPr>
-    </w:lvl>
-    <w:lvl w:ilvl="5" w:tplc="0409001B" w:tentative="1">
-      <w:start w:val="1"/>
-      <w:numFmt w:val="lowerRoman"/>
-      <w:lvlText w:val="%6."/>
-      <w:lvlJc w:val="right"/>
-      <w:pPr>
-        <w:ind w:left="4320" w:hanging="180"/>
-      </w:pPr>
-    </w:lvl>
-    <w:lvl w:ilvl="6" w:tplc="0409000F" w:tentative="1">
+      <w:pStyle w:val="TieuDe110"/>
+      <w:lvlText w:val="%1.%2."/>
+      <w:lvlJc w:val="left"/>
+      <w:pPr>
+        <w:ind w:left="792" w:hanging="432"/>
+      </w:pPr>
+      <w:rPr>
+        <w:rFonts w:hint="default"/>
+      </w:rPr>
+    </w:lvl>
+    <w:lvl w:ilvl="2">
       <w:start w:val="1"/>
       <w:numFmt w:val="decimal"/>
-      <w:lvlText w:val="%7."/>
-      <w:lvlJc w:val="left"/>
-      <w:pPr>
-        <w:ind w:left="5040" w:hanging="360"/>
-      </w:pPr>
-    </w:lvl>
-    <w:lvl w:ilvl="7" w:tplc="04090019" w:tentative="1">
-      <w:start w:val="1"/>
-      <w:numFmt w:val="lowerLetter"/>
-      <w:lvlText w:val="%8."/>
-      <w:lvlJc w:val="left"/>
-      <w:pPr>
-        <w:ind w:left="5760" w:hanging="360"/>
-      </w:pPr>
-    </w:lvl>
-    <w:lvl w:ilvl="8" w:tplc="0409001B" w:tentative="1">
-      <w:start w:val="1"/>
-      <w:numFmt w:val="lowerRoman"/>
-      <w:lvlText w:val="%9."/>
-      <w:lvlJc w:val="right"/>
-      <w:pPr>
-        <w:ind w:left="6480" w:hanging="180"/>
-      </w:pPr>
+      <w:pStyle w:val="TieuDe111"/>
+      <w:lvlText w:val="%1.%2.%3."/>
+      <w:lvlJc w:val="left"/>
+      <w:pPr>
+        <w:ind w:left="1224" w:hanging="504"/>
+      </w:pPr>
+      <w:rPr>
+        <w:rFonts w:hint="default"/>
+      </w:rPr>
+    </w:lvl>
+    <w:lvl w:ilvl="3">
+      <w:start w:val="1"/>
+      <w:numFmt w:val="decimal"/>
+      <w:lvlText w:val="%1.%2.%3.%4."/>
+      <w:lvlJc w:val="left"/>
+      <w:pPr>
+        <w:ind w:left="1728" w:hanging="648"/>
+      </w:pPr>
+      <w:rPr>
+        <w:rFonts w:hint="default"/>
+      </w:rPr>
+    </w:lvl>
+    <w:lvl w:ilvl="4">
+      <w:start w:val="1"/>
+      <w:numFmt w:val="decimal"/>
+      <w:lvlText w:val="%1.%2.%3.%4.%5."/>
+      <w:lvlJc w:val="left"/>
+      <w:pPr>
+        <w:ind w:left="2232" w:hanging="792"/>
+      </w:pPr>
+      <w:rPr>
+        <w:rFonts w:hint="default"/>
+      </w:rPr>
+    </w:lvl>
+    <w:lvl w:ilvl="5">
+      <w:start w:val="1"/>
+      <w:numFmt w:val="decimal"/>
+      <w:lvlText w:val="%1.%2.%3.%4.%5.%6."/>
+      <w:lvlJc w:val="left"/>
+      <w:pPr>
+        <w:ind w:left="2736" w:hanging="936"/>
+      </w:pPr>
+      <w:rPr>
+        <w:rFonts w:hint="default"/>
+      </w:rPr>
+    </w:lvl>
+    <w:lvl w:ilvl="6">
+      <w:start w:val="1"/>
+      <w:numFmt w:val="decimal"/>
+      <w:lvlText w:val="%1.%2.%3.%4.%5.%6.%7."/>
+      <w:lvlJc w:val="left"/>
+      <w:pPr>
+        <w:ind w:left="3240" w:hanging="1080"/>
+      </w:pPr>
+      <w:rPr>
+        <w:rFonts w:hint="default"/>
+      </w:rPr>
+    </w:lvl>
+    <w:lvl w:ilvl="7">
+      <w:start w:val="1"/>
+      <w:numFmt w:val="decimal"/>
+      <w:lvlText w:val="%1.%2.%3.%4.%5.%6.%7.%8."/>
+      <w:lvlJc w:val="left"/>
+      <w:pPr>
+        <w:ind w:left="3744" w:hanging="1224"/>
+      </w:pPr>
+      <w:rPr>
+        <w:rFonts w:hint="default"/>
+      </w:rPr>
+    </w:lvl>
+    <w:lvl w:ilvl="8">
+      <w:start w:val="1"/>
+      <w:numFmt w:val="decimal"/>
+      <w:lvlText w:val="%1.%2.%3.%4.%5.%6.%7.%8.%9."/>
+      <w:lvlJc w:val="left"/>
+      <w:pPr>
+        <w:ind w:left="4320" w:hanging="1440"/>
+      </w:pPr>
+      <w:rPr>
+        <w:rFonts w:hint="default"/>
+      </w:rPr>
     </w:lvl>
   </w:abstractNum>
-  <w:num w:numId="1" w16cid:durableId="2103641946">
+  <w:num w:numId="1" w16cid:durableId="524367896">
     <w:abstractNumId w:val="1"/>
   </w:num>
-  <w:num w:numId="2" w16cid:durableId="1934584668">
+  <w:num w:numId="2" w16cid:durableId="36979918">
+    <w:abstractNumId w:val="2"/>
+  </w:num>
+  <w:num w:numId="3" w16cid:durableId="1060979119">
     <w:abstractNumId w:val="3"/>
   </w:num>
-  <w:num w:numId="3" w16cid:durableId="1791700794">
+  <w:num w:numId="4" w16cid:durableId="501941511">
     <w:abstractNumId w:val="0"/>
   </w:num>
-  <w:num w:numId="4" w16cid:durableId="1599605234">
-    <w:abstractNumId w:val="2"/>
-  </w:num>
-  <w:num w:numId="5" w16cid:durableId="1332097726">
+  <w:num w:numId="5" w16cid:durableId="1161625705">
     <w:abstractNumId w:val="4"/>
   </w:num>
 </w:numbering>
@@ -1480,7 +2751,7 @@
     <w:link w:val="Heading1Char"/>
     <w:uiPriority w:val="9"/>
     <w:qFormat/>
-    <w:rsid w:val="005B363E"/>
+    <w:rsid w:val="00C878BF"/>
     <w:pPr>
       <w:keepNext/>
       <w:keepLines/>
@@ -1503,7 +2774,7 @@
     <w:semiHidden/>
     <w:unhideWhenUsed/>
     <w:qFormat/>
-    <w:rsid w:val="005B363E"/>
+    <w:rsid w:val="00C878BF"/>
     <w:pPr>
       <w:keepNext/>
       <w:keepLines/>
@@ -1526,7 +2797,7 @@
     <w:semiHidden/>
     <w:unhideWhenUsed/>
     <w:qFormat/>
-    <w:rsid w:val="005B363E"/>
+    <w:rsid w:val="00C878BF"/>
     <w:pPr>
       <w:keepNext/>
       <w:keepLines/>
@@ -1549,7 +2820,7 @@
     <w:semiHidden/>
     <w:unhideWhenUsed/>
     <w:qFormat/>
-    <w:rsid w:val="005B363E"/>
+    <w:rsid w:val="00C878BF"/>
     <w:pPr>
       <w:keepNext/>
       <w:keepLines/>
@@ -1572,7 +2843,7 @@
     <w:semiHidden/>
     <w:unhideWhenUsed/>
     <w:qFormat/>
-    <w:rsid w:val="005B363E"/>
+    <w:rsid w:val="00C878BF"/>
     <w:pPr>
       <w:keepNext/>
       <w:keepLines/>
@@ -1593,7 +2864,7 @@
     <w:semiHidden/>
     <w:unhideWhenUsed/>
     <w:qFormat/>
-    <w:rsid w:val="005B363E"/>
+    <w:rsid w:val="00C878BF"/>
     <w:pPr>
       <w:keepNext/>
       <w:keepLines/>
@@ -1616,7 +2887,7 @@
     <w:semiHidden/>
     <w:unhideWhenUsed/>
     <w:qFormat/>
-    <w:rsid w:val="005B363E"/>
+    <w:rsid w:val="00C878BF"/>
     <w:pPr>
       <w:keepNext/>
       <w:keepLines/>
@@ -1637,7 +2908,7 @@
     <w:semiHidden/>
     <w:unhideWhenUsed/>
     <w:qFormat/>
-    <w:rsid w:val="005B363E"/>
+    <w:rsid w:val="00C878BF"/>
     <w:pPr>
       <w:keepNext/>
       <w:keepLines/>
@@ -1660,7 +2931,7 @@
     <w:semiHidden/>
     <w:unhideWhenUsed/>
     <w:qFormat/>
-    <w:rsid w:val="005B363E"/>
+    <w:rsid w:val="00C878BF"/>
     <w:pPr>
       <w:keepNext/>
       <w:keepLines/>
@@ -1698,12 +2969,191 @@
     <w:semiHidden/>
     <w:unhideWhenUsed/>
   </w:style>
+  <w:style w:type="paragraph" w:customStyle="1" w:styleId="0NoiDung">
+    <w:name w:val="0.NoiDung"/>
+    <w:basedOn w:val="Normal"/>
+    <w:qFormat/>
+    <w:rsid w:val="006B6616"/>
+    <w:pPr>
+      <w:spacing w:before="60" w:after="60" w:line="312" w:lineRule="auto"/>
+      <w:ind w:firstLine="720"/>
+      <w:jc w:val="both"/>
+    </w:pPr>
+    <w:rPr>
+      <w:rFonts w:ascii="Times New Roman" w:hAnsi="Times New Roman"/>
+      <w:noProof/>
+    </w:rPr>
+  </w:style>
+  <w:style w:type="paragraph" w:customStyle="1" w:styleId="TieuDe1">
+    <w:name w:val="TieuDe1."/>
+    <w:basedOn w:val="Normal"/>
+    <w:qFormat/>
+    <w:rsid w:val="004624F4"/>
+    <w:pPr>
+      <w:numPr>
+        <w:numId w:val="5"/>
+      </w:numPr>
+      <w:spacing w:before="60" w:after="60"/>
+      <w:outlineLvl w:val="0"/>
+    </w:pPr>
+    <w:rPr>
+      <w:rFonts w:ascii="Times New Roman" w:hAnsi="Times New Roman"/>
+      <w:b/>
+      <w:sz w:val="26"/>
+    </w:rPr>
+  </w:style>
+  <w:style w:type="paragraph" w:customStyle="1" w:styleId="TIeuDe11">
+    <w:name w:val="TIeuDe1.1"/>
+    <w:basedOn w:val="Normal"/>
+    <w:qFormat/>
+    <w:rsid w:val="006B6616"/>
+    <w:pPr>
+      <w:numPr>
+        <w:ilvl w:val="3"/>
+        <w:numId w:val="4"/>
+      </w:numPr>
+      <w:spacing w:before="60" w:after="60" w:line="312" w:lineRule="auto"/>
+      <w:outlineLvl w:val="1"/>
+    </w:pPr>
+    <w:rPr>
+      <w:rFonts w:ascii="Times New Roman" w:hAnsi="Times New Roman"/>
+      <w:b/>
+      <w:noProof/>
+      <w:sz w:val="26"/>
+    </w:rPr>
+  </w:style>
+  <w:style w:type="paragraph" w:customStyle="1" w:styleId="TieuDe111">
+    <w:name w:val="TieuDe1.1.1"/>
+    <w:basedOn w:val="Normal"/>
+    <w:qFormat/>
+    <w:rsid w:val="006B6616"/>
+    <w:pPr>
+      <w:numPr>
+        <w:ilvl w:val="2"/>
+        <w:numId w:val="5"/>
+      </w:numPr>
+      <w:spacing w:before="60" w:after="60" w:line="312" w:lineRule="auto"/>
+      <w:contextualSpacing/>
+      <w:jc w:val="both"/>
+      <w:outlineLvl w:val="2"/>
+    </w:pPr>
+    <w:rPr>
+      <w:rFonts w:ascii="Times New Roman" w:hAnsi="Times New Roman"/>
+      <w:b/>
+      <w:bCs/>
+      <w:sz w:val="26"/>
+    </w:rPr>
+  </w:style>
+  <w:style w:type="paragraph" w:styleId="TOC1">
+    <w:name w:val="toc 1"/>
+    <w:basedOn w:val="Normal"/>
+    <w:next w:val="Normal"/>
+    <w:autoRedefine/>
+    <w:uiPriority w:val="39"/>
+    <w:unhideWhenUsed/>
+    <w:rsid w:val="006B6616"/>
+    <w:pPr>
+      <w:spacing w:after="0" w:line="312" w:lineRule="auto"/>
+    </w:pPr>
+    <w:rPr>
+      <w:rFonts w:ascii="Times New Roman" w:hAnsi="Times New Roman"/>
+      <w:sz w:val="26"/>
+    </w:rPr>
+  </w:style>
+  <w:style w:type="paragraph" w:styleId="TOC2">
+    <w:name w:val="toc 2"/>
+    <w:basedOn w:val="Normal"/>
+    <w:next w:val="Normal"/>
+    <w:autoRedefine/>
+    <w:uiPriority w:val="39"/>
+    <w:unhideWhenUsed/>
+    <w:rsid w:val="006B6616"/>
+    <w:pPr>
+      <w:spacing w:after="0" w:line="312" w:lineRule="auto"/>
+      <w:ind w:left="261"/>
+      <w:jc w:val="both"/>
+    </w:pPr>
+    <w:rPr>
+      <w:rFonts w:ascii="Times New Roman" w:hAnsi="Times New Roman"/>
+      <w:sz w:val="26"/>
+    </w:rPr>
+  </w:style>
+  <w:style w:type="paragraph" w:styleId="TOC3">
+    <w:name w:val="toc 3"/>
+    <w:basedOn w:val="Normal"/>
+    <w:next w:val="Normal"/>
+    <w:autoRedefine/>
+    <w:uiPriority w:val="39"/>
+    <w:semiHidden/>
+    <w:unhideWhenUsed/>
+    <w:rsid w:val="006B6616"/>
+    <w:pPr>
+      <w:spacing w:after="0" w:line="312" w:lineRule="auto"/>
+      <w:ind w:left="522"/>
+    </w:pPr>
+    <w:rPr>
+      <w:rFonts w:ascii="Times New Roman" w:hAnsi="Times New Roman"/>
+      <w:sz w:val="26"/>
+    </w:rPr>
+  </w:style>
+  <w:style w:type="paragraph" w:customStyle="1" w:styleId="TieuDeHinh">
+    <w:name w:val="TieuDeHinh"/>
+    <w:basedOn w:val="Normal"/>
+    <w:qFormat/>
+    <w:rsid w:val="006B6616"/>
+    <w:pPr>
+      <w:ind w:left="720"/>
+      <w:jc w:val="center"/>
+    </w:pPr>
+    <w:rPr>
+      <w:rFonts w:ascii="Times New Roman" w:hAnsi="Times New Roman"/>
+      <w:i/>
+      <w:sz w:val="26"/>
+    </w:rPr>
+  </w:style>
+  <w:style w:type="paragraph" w:styleId="TableofFigures">
+    <w:name w:val="table of figures"/>
+    <w:basedOn w:val="Normal"/>
+    <w:next w:val="Normal"/>
+    <w:uiPriority w:val="99"/>
+    <w:semiHidden/>
+    <w:unhideWhenUsed/>
+    <w:rsid w:val="006B6616"/>
+    <w:pPr>
+      <w:spacing w:after="0"/>
+      <w:jc w:val="both"/>
+    </w:pPr>
+    <w:rPr>
+      <w:rFonts w:ascii="Times New Roman" w:hAnsi="Times New Roman"/>
+      <w:sz w:val="26"/>
+    </w:rPr>
+  </w:style>
+  <w:style w:type="paragraph" w:customStyle="1" w:styleId="TieuDe110">
+    <w:name w:val="TieuDe1.1"/>
+    <w:basedOn w:val="Normal"/>
+    <w:qFormat/>
+    <w:rsid w:val="004624F4"/>
+    <w:pPr>
+      <w:numPr>
+        <w:ilvl w:val="1"/>
+        <w:numId w:val="5"/>
+      </w:numPr>
+      <w:spacing w:before="60" w:after="60" w:line="312" w:lineRule="auto"/>
+      <w:outlineLvl w:val="1"/>
+    </w:pPr>
+    <w:rPr>
+      <w:rFonts w:ascii="Times New Roman" w:hAnsi="Times New Roman"/>
+      <w:b/>
+      <w:noProof/>
+      <w:sz w:val="26"/>
+    </w:rPr>
+  </w:style>
   <w:style w:type="character" w:customStyle="1" w:styleId="Heading1Char">
     <w:name w:val="Heading 1 Char"/>
     <w:basedOn w:val="DefaultParagraphFont"/>
     <w:link w:val="Heading1"/>
     <w:uiPriority w:val="9"/>
-    <w:rsid w:val="005B363E"/>
+    <w:rsid w:val="00C878BF"/>
     <w:rPr>
       <w:rFonts w:asciiTheme="majorHAnsi" w:eastAsiaTheme="majorEastAsia" w:hAnsiTheme="majorHAnsi" w:cstheme="majorBidi"/>
       <w:color w:val="0F4761" w:themeColor="accent1" w:themeShade="BF"/>
@@ -1717,7 +3167,7 @@
     <w:link w:val="Heading2"/>
     <w:uiPriority w:val="9"/>
     <w:semiHidden/>
-    <w:rsid w:val="005B363E"/>
+    <w:rsid w:val="00C878BF"/>
     <w:rPr>
       <w:rFonts w:asciiTheme="majorHAnsi" w:eastAsiaTheme="majorEastAsia" w:hAnsiTheme="majorHAnsi" w:cstheme="majorBidi"/>
       <w:color w:val="0F4761" w:themeColor="accent1" w:themeShade="BF"/>
@@ -1731,7 +3181,7 @@
     <w:link w:val="Heading3"/>
     <w:uiPriority w:val="9"/>
     <w:semiHidden/>
-    <w:rsid w:val="005B363E"/>
+    <w:rsid w:val="00C878BF"/>
     <w:rPr>
       <w:rFonts w:eastAsiaTheme="majorEastAsia" w:cstheme="majorBidi"/>
       <w:color w:val="0F4761" w:themeColor="accent1" w:themeShade="BF"/>
@@ -1745,7 +3195,7 @@
     <w:link w:val="Heading4"/>
     <w:uiPriority w:val="9"/>
     <w:semiHidden/>
-    <w:rsid w:val="005B363E"/>
+    <w:rsid w:val="00C878BF"/>
     <w:rPr>
       <w:rFonts w:eastAsiaTheme="majorEastAsia" w:cstheme="majorBidi"/>
       <w:i/>
@@ -1759,7 +3209,7 @@
     <w:link w:val="Heading5"/>
     <w:uiPriority w:val="9"/>
     <w:semiHidden/>
-    <w:rsid w:val="005B363E"/>
+    <w:rsid w:val="00C878BF"/>
     <w:rPr>
       <w:rFonts w:eastAsiaTheme="majorEastAsia" w:cstheme="majorBidi"/>
       <w:color w:val="0F4761" w:themeColor="accent1" w:themeShade="BF"/>
@@ -1771,7 +3221,7 @@
     <w:link w:val="Heading6"/>
     <w:uiPriority w:val="9"/>
     <w:semiHidden/>
-    <w:rsid w:val="005B363E"/>
+    <w:rsid w:val="00C878BF"/>
     <w:rPr>
       <w:rFonts w:eastAsiaTheme="majorEastAsia" w:cstheme="majorBidi"/>
       <w:i/>
@@ -1785,7 +3235,7 @@
     <w:link w:val="Heading7"/>
     <w:uiPriority w:val="9"/>
     <w:semiHidden/>
-    <w:rsid w:val="005B363E"/>
+    <w:rsid w:val="00C878BF"/>
     <w:rPr>
       <w:rFonts w:eastAsiaTheme="majorEastAsia" w:cstheme="majorBidi"/>
       <w:color w:val="595959" w:themeColor="text1" w:themeTint="A6"/>
@@ -1797,7 +3247,7 @@
     <w:link w:val="Heading8"/>
     <w:uiPriority w:val="9"/>
     <w:semiHidden/>
-    <w:rsid w:val="005B363E"/>
+    <w:rsid w:val="00C878BF"/>
     <w:rPr>
       <w:rFonts w:eastAsiaTheme="majorEastAsia" w:cstheme="majorBidi"/>
       <w:i/>
@@ -1811,7 +3261,7 @@
     <w:link w:val="Heading9"/>
     <w:uiPriority w:val="9"/>
     <w:semiHidden/>
-    <w:rsid w:val="005B363E"/>
+    <w:rsid w:val="00C878BF"/>
     <w:rPr>
       <w:rFonts w:eastAsiaTheme="majorEastAsia" w:cstheme="majorBidi"/>
       <w:color w:val="272727" w:themeColor="text1" w:themeTint="D8"/>
@@ -1824,7 +3274,7 @@
     <w:link w:val="TitleChar"/>
     <w:uiPriority w:val="10"/>
     <w:qFormat/>
-    <w:rsid w:val="005B363E"/>
+    <w:rsid w:val="00C878BF"/>
     <w:pPr>
       <w:spacing w:after="80" w:line="240" w:lineRule="auto"/>
       <w:contextualSpacing/>
@@ -1842,7 +3292,7 @@
     <w:basedOn w:val="DefaultParagraphFont"/>
     <w:link w:val="Title"/>
     <w:uiPriority w:val="10"/>
-    <w:rsid w:val="005B363E"/>
+    <w:rsid w:val="00C878BF"/>
     <w:rPr>
       <w:rFonts w:asciiTheme="majorHAnsi" w:eastAsiaTheme="majorEastAsia" w:hAnsiTheme="majorHAnsi" w:cstheme="majorBidi"/>
       <w:spacing w:val="-10"/>
@@ -1858,7 +3308,7 @@
     <w:link w:val="SubtitleChar"/>
     <w:uiPriority w:val="11"/>
     <w:qFormat/>
-    <w:rsid w:val="005B363E"/>
+    <w:rsid w:val="00C878BF"/>
     <w:pPr>
       <w:numPr>
         <w:ilvl w:val="1"/>
@@ -1877,7 +3327,7 @@
     <w:basedOn w:val="DefaultParagraphFont"/>
     <w:link w:val="Subtitle"/>
     <w:uiPriority w:val="11"/>
-    <w:rsid w:val="005B363E"/>
+    <w:rsid w:val="00C878BF"/>
     <w:rPr>
       <w:rFonts w:eastAsiaTheme="majorEastAsia" w:cstheme="majorBidi"/>
       <w:color w:val="595959" w:themeColor="text1" w:themeTint="A6"/>
@@ -1893,7 +3343,7 @@
     <w:link w:val="QuoteChar"/>
     <w:uiPriority w:val="29"/>
     <w:qFormat/>
-    <w:rsid w:val="005B363E"/>
+    <w:rsid w:val="00C878BF"/>
     <w:pPr>
       <w:spacing w:before="160"/>
       <w:jc w:val="center"/>
@@ -1909,7 +3359,7 @@
     <w:basedOn w:val="DefaultParagraphFont"/>
     <w:link w:val="Quote"/>
     <w:uiPriority w:val="29"/>
-    <w:rsid w:val="005B363E"/>
+    <w:rsid w:val="00C878BF"/>
     <w:rPr>
       <w:i/>
       <w:iCs/>
@@ -1921,7 +3371,7 @@
     <w:basedOn w:val="Normal"/>
     <w:uiPriority w:val="34"/>
     <w:qFormat/>
-    <w:rsid w:val="005B363E"/>
+    <w:rsid w:val="00C878BF"/>
     <w:pPr>
       <w:ind w:left="720"/>
       <w:contextualSpacing/>
@@ -1932,7 +3382,7 @@
     <w:basedOn w:val="DefaultParagraphFont"/>
     <w:uiPriority w:val="21"/>
     <w:qFormat/>
-    <w:rsid w:val="005B363E"/>
+    <w:rsid w:val="00C878BF"/>
     <w:rPr>
       <w:i/>
       <w:iCs/>
@@ -1946,7 +3396,7 @@
     <w:link w:val="IntenseQuoteChar"/>
     <w:uiPriority w:val="30"/>
     <w:qFormat/>
-    <w:rsid w:val="005B363E"/>
+    <w:rsid w:val="00C878BF"/>
     <w:pPr>
       <w:pBdr>
         <w:top w:val="single" w:sz="4" w:space="10" w:color="0F4761" w:themeColor="accent1" w:themeShade="BF"/>
@@ -1967,7 +3417,7 @@
     <w:basedOn w:val="DefaultParagraphFont"/>
     <w:link w:val="IntenseQuote"/>
     <w:uiPriority w:val="30"/>
-    <w:rsid w:val="005B363E"/>
+    <w:rsid w:val="00C878BF"/>
     <w:rPr>
       <w:i/>
       <w:iCs/>
@@ -1979,7 +3429,7 @@
     <w:basedOn w:val="DefaultParagraphFont"/>
     <w:uiPriority w:val="32"/>
     <w:qFormat/>
-    <w:rsid w:val="005B363E"/>
+    <w:rsid w:val="00C878BF"/>
     <w:rPr>
       <w:b/>
       <w:bCs/>
@@ -1988,49 +3438,15 @@
       <w:spacing w:val="5"/>
     </w:rPr>
   </w:style>
-  <w:style w:type="paragraph" w:customStyle="1" w:styleId="0NoiDung">
-    <w:name w:val="0.NoiDung"/>
-    <w:basedOn w:val="Normal"/>
-    <w:qFormat/>
-    <w:rsid w:val="00953B1C"/>
-    <w:pPr>
-      <w:spacing w:before="60" w:after="60" w:line="312" w:lineRule="auto"/>
-      <w:ind w:firstLine="720"/>
-      <w:jc w:val="both"/>
-    </w:pPr>
-    <w:rPr>
-      <w:rFonts w:ascii="Times New Roman" w:hAnsi="Times New Roman"/>
-      <w:noProof/>
-    </w:rPr>
-  </w:style>
-  <w:style w:type="paragraph" w:customStyle="1" w:styleId="TieuDe1">
-    <w:name w:val="TieuDe1."/>
-    <w:basedOn w:val="Normal"/>
-    <w:qFormat/>
-    <w:rsid w:val="00953B1C"/>
-    <w:pPr>
-      <w:spacing w:before="60" w:after="60"/>
-      <w:outlineLvl w:val="0"/>
-    </w:pPr>
-    <w:rPr>
-      <w:b/>
-      <w:sz w:val="26"/>
-    </w:rPr>
-  </w:style>
-  <w:style w:type="paragraph" w:customStyle="1" w:styleId="TIeuDe11">
-    <w:name w:val="TIeuDe1.1"/>
-    <w:basedOn w:val="Normal"/>
-    <w:qFormat/>
-    <w:rsid w:val="00052643"/>
-    <w:pPr>
-      <w:spacing w:before="60" w:after="60" w:line="312" w:lineRule="auto"/>
-      <w:outlineLvl w:val="1"/>
-    </w:pPr>
-    <w:rPr>
-      <w:rFonts w:ascii="Times New Roman" w:hAnsi="Times New Roman"/>
-      <w:b/>
-      <w:noProof/>
-      <w:sz w:val="26"/>
+  <w:style w:type="character" w:styleId="Hyperlink">
+    <w:name w:val="Hyperlink"/>
+    <w:basedOn w:val="DefaultParagraphFont"/>
+    <w:uiPriority w:val="99"/>
+    <w:unhideWhenUsed/>
+    <w:rsid w:val="007D46BC"/>
+    <w:rPr>
+      <w:color w:val="467886" w:themeColor="hyperlink"/>
+      <w:u w:val="single"/>
     </w:rPr>
   </w:style>
 </w:styles>
@@ -2349,4 +3765,16 @@
     </a:ext>
   </a:extLst>
 </a:theme>
+</file>
+
+<file path=customXml/item1.xml><?xml version="1.0" encoding="utf-8"?>
+<b:Sources xmlns:b="http://schemas.openxmlformats.org/officeDocument/2006/bibliography" xmlns="http://schemas.openxmlformats.org/officeDocument/2006/bibliography" SelectedStyle="\APASixthEditionOfficeOnline.xsl" StyleName="APA" Version="6"/>
+</file>
+
+<file path=customXml/itemProps1.xml><?xml version="1.0" encoding="utf-8"?>
+<ds:datastoreItem xmlns:ds="http://schemas.openxmlformats.org/officeDocument/2006/customXml" ds:itemID="{A58ADAA5-AF4A-4028-9F4E-91AB226B02FB}">
+  <ds:schemaRefs>
+    <ds:schemaRef ds:uri="http://schemas.openxmlformats.org/officeDocument/2006/bibliography"/>
+  </ds:schemaRefs>
+</ds:datastoreItem>
 </file>
</xml_diff>